<commit_message>
feat(hw01): add HW01 report and supporting documents for AI compliance
Introduced a comprehensive report detailing QA/QC job market analysis, software defects, and physical product testing. Included a PDF version of the report and removed the outdated PLAN.md file. Updated AI forms for compliance documentation.
</commit_message>
<xml_diff>
--- a/HW01/AI_Forms/[AI-03] - FIT@HCMUS - AI Disclosure Form_En - HW01.docx
+++ b/HW01/AI_Forms/[AI-03] - FIT@HCMUS - AI Disclosure Form_En - HW01.docx
@@ -1,1198 +1,1199 @@
 
 <file path=word/document.xml><?xml version="1.0" encoding="utf-8"?>
-<ns0:document xmlns:ns0="http://schemas.openxmlformats.org/wordprocessingml/2006/main" xmlns:ns1="http://schemas.openxmlformats.org/markup-compatibility/2006" xmlns:ns2="http://schemas.microsoft.com/office/word/2010/wordml" xmlns:ns3="http://schemas.openxmlformats.org/drawingml/2006/wordprocessingDrawing" xmlns:ns4="http://schemas.microsoft.com/office/word/2010/wordprocessingDrawing" xmlns:ns5="http://schemas.openxmlformats.org/drawingml/2006/main" xmlns:ns6="http://schemas.openxmlformats.org/drawingml/2006/picture" xmlns:ns7="http://schemas.openxmlformats.org/officeDocument/2006/relationships" xmlns:ns8="http://schemas.microsoft.com/office/drawing/2010/main" ns1:Ignorable="w14 w15 w16se w16cid w16 w16cex w16sdtdh w16sdtfl w16du wp14">
-  <ns0:body>
-    <ns0:p ns2:paraId="0501E4E0" ns2:textId="77777777" ns0:rsidR="00966BE1" ns0:rsidRDefault="00000000">
-      <ns0:pPr>
-        <ns0:jc ns0:val="center"/>
-      </ns0:pPr>
-      <ns0:r>
-        <ns0:rPr>
-          <ns0:rFonts ns0:ascii="Arial" ns0:hAnsi="Arial"/>
-          <ns0:b/>
-        </ns0:rPr>
-        <ns0:t>Faculty of Information Technology (FIT) – Ho Chi Minh City University of Science (HCMUS)</ns0:t>
-      </ns0:r>
-    </ns0:p>
-    <ns0:p ns2:paraId="34B623F1" ns2:textId="1C09F91D" ns0:rsidR="00966BE1" ns0:rsidRDefault="00000000">
-      <ns0:pPr>
-        <ns0:jc ns0:val="center"/>
-      </ns0:pPr>
-      <ns0:r>
-        <ns0:rPr>
-          <ns0:rFonts ns0:ascii="Arial" ns0:hAnsi="Arial"/>
-          <ns0:b/>
-        </ns0:rPr>
-        <ns0:t>CS423 / CSC1</ns0:t>
-      </ns0:r>
-      <ns0:r ns0:rsidR="00B27C6B">
-        <ns0:rPr>
-          <ns0:rFonts ns0:ascii="Arial" ns0:hAnsi="Arial"/>
-          <ns0:b/>
-        </ns0:rPr>
-        <ns0:t>3</ns0:t>
-      </ns0:r>
-      <ns0:r>
-        <ns0:rPr>
-          <ns0:rFonts ns0:ascii="Arial" ns0:hAnsi="Arial"/>
-          <ns0:b/>
-        </ns0:rPr>
-        <ns0:t>003 – Software Testing (AI-augmented · 2026)</ns0:t>
-      </ns0:r>
-    </ns0:p>
-    <ns0:p ns2:paraId="4A8DA1BA" ns2:textId="77777777" ns0:rsidR="00966BE1" ns0:rsidRDefault="00000000">
-      <ns0:pPr>
-        <ns0:jc ns0:val="center"/>
-      </ns0:pPr>
-      <ns0:r>
-        <ns0:rPr>
-          <ns0:rFonts ns0:ascii="Arial" ns0:hAnsi="Arial"/>
-          <ns0:b/>
-          <ns0:color ns0:val="C00000"/>
-          <ns0:sz ns0:val="20"/>
-        </ns0:rPr>
-        <ns0:t>AI POLICY · TEMPLATES — 2026 v1.0</ns0:t>
-      </ns0:r>
-    </ns0:p>
-    <ns0:p ns2:paraId="368239DB" ns2:textId="77777777" ns0:rsidR="00966BE1" ns0:rsidRDefault="00000000">
-      <ns0:pPr>
-        <ns0:pStyle ns0:val="Heading1"/>
-      </ns0:pPr>
-      <ns0:r>
-        <ns0:rPr>
-          <ns0:rFonts ns0:ascii="Arial" ns0:hAnsi="Arial"/>
-        </ns0:rPr>
-        <ns0:t>AI Use Disclosure Form</ns0:t>
-      </ns0:r>
-    </ns0:p>
-    <ns0:p ns2:paraId="3CF265DE" ns2:textId="77777777" ns0:rsidR="00966BE1" ns0:rsidRDefault="00000000">
-      <ns0:r>
-        <ns0:rPr>
-          <ns0:rFonts ns0:ascii="Arial" ns0:hAnsi="Arial"/>
-          <ns0:i/>
-        </ns0:rPr>
-        <ns0:t>Attach to assignments where AI was used in any permitted capacity.</ns0:t>
-      </ns0:r>
-    </ns0:p>
-    <ns0:p ns2:paraId="3A3AD149" ns2:textId="77777777" ns0:rsidR="00966BE1" ns0:rsidRDefault="00000000">
-      <ns0:r>
-        <ns0:rPr>
-          <ns0:rFonts ns0:ascii="Arial" ns0:hAnsi="Arial"/>
-          <ns0:i/>
-          <ns0:color ns0:val="707070"/>
-          <ns0:sz ns0:val="18"/>
-        </ns0:rPr>
-        <ns0:t>Adapted from Med Kharbach, PhD (2026) — AI Use Policy Templates for Higher Education. CC BY-NC-SA 4.0. This adaptation is prepared for FIT@HCMUS – CS423 / CSC15003 Software Testing course.</ns0:t>
-      </ns0:r>
-    </ns0:p>
-    <ns0:p ns2:paraId="7D7BBCFA" ns2:textId="77777777" ns0:rsidR="00966BE1" ns0:rsidRDefault="00000000">
-      <ns0:pPr>
-        <ns0:pStyle ns0:val="Heading2"/>
-      </ns0:pPr>
-      <ns0:r>
-        <ns0:rPr>
-          <ns0:rFonts ns0:ascii="Arial" ns0:hAnsi="Arial"/>
-        </ns0:rPr>
-        <ns0:t>1. Course &amp; Student Info</ns0:t>
-      </ns0:r>
-    </ns0:p>
-    <ns0:tbl>
-      <ns0:tblPr>
-        <ns0:tblStyle ns0:val="LightGrid-Accent1"/>
-        <ns0:tblW ns0:w="0" ns0:type="auto"/>
-        <ns0:tblLayout ns0:type="fixed"/>
-        <ns0:tblLook ns0:val="04A0" ns0:firstRow="1" ns0:lastRow="0" ns0:firstColumn="1" ns0:lastColumn="0" ns0:noHBand="0" ns0:noVBand="1"/>
-      </ns0:tblPr>
-      <ns0:tblGrid>
-        <ns0:gridCol ns0:w="3118"/>
-        <ns0:gridCol ns0:w="6520"/>
-      </ns0:tblGrid>
-      <ns0:tr ns0:rsidR="00966BE1" ns2:paraId="590A0F79" ns2:textId="77777777" ns0:rsidTr="00966BE1">
-        <ns0:trPr>
-          <ns0:cnfStyle ns0:val="100000000000" ns0:firstRow="1" ns0:lastRow="0" ns0:firstColumn="0" ns0:lastColumn="0" ns0:oddVBand="0" ns0:evenVBand="0" ns0:oddHBand="0" ns0:evenHBand="0" ns0:firstRowFirstColumn="0" ns0:firstRowLastColumn="0" ns0:lastRowFirstColumn="0" ns0:lastRowLastColumn="0"/>
-        </ns0:trPr>
-        <ns0:tc>
-          <ns0:tcPr>
-            <ns0:cnfStyle ns0:val="001000000000" ns0:firstRow="0" ns0:lastRow="0" ns0:firstColumn="1" ns0:lastColumn="0" ns0:oddVBand="0" ns0:evenVBand="0" ns0:oddHBand="0" ns0:evenHBand="0" ns0:firstRowFirstColumn="0" ns0:firstRowLastColumn="0" ns0:lastRowFirstColumn="0" ns0:lastRowLastColumn="0"/>
-            <ns0:tcW ns0:w="3118" ns0:type="dxa"/>
-            <ns0:shd ns0:val="clear" ns0:color="auto" ns0:fill="1F4E79"/>
-            <ns0:vAlign ns0:val="center"/>
-          </ns0:tcPr>
-          <ns0:p ns2:paraId="0F0DAC66" ns2:textId="77777777" ns0:rsidR="00966BE1" ns0:rsidRDefault="00000000">
-            <ns0:r>
-              <ns0:rPr>
-                <ns0:rFonts ns0:ascii="Arial" ns0:hAnsi="Arial"/>
-                <ns0:color ns0:val="FFFFFF"/>
-              </ns0:rPr>
-              <ns0:t>Field</ns0:t>
-            </ns0:r>
-          </ns0:p>
-        </ns0:tc>
-        <ns0:tc>
-          <ns0:tcPr>
-            <ns0:tcW ns0:w="6520" ns0:type="dxa"/>
-            <ns0:shd ns0:val="clear" ns0:color="auto" ns0:fill="1F4E79"/>
-            <ns0:vAlign ns0:val="center"/>
-          </ns0:tcPr>
-          <ns0:p ns2:paraId="1A9B75FC" ns2:textId="77777777" ns0:rsidR="00966BE1" ns0:rsidRDefault="00000000">
-            <ns0:pPr>
-              <ns0:cnfStyle ns0:val="100000000000" ns0:firstRow="1" ns0:lastRow="0" ns0:firstColumn="0" ns0:lastColumn="0" ns0:oddVBand="0" ns0:evenVBand="0" ns0:oddHBand="0" ns0:evenHBand="0" ns0:firstRowFirstColumn="0" ns0:firstRowLastColumn="0" ns0:lastRowFirstColumn="0" ns0:lastRowLastColumn="0"/>
-            </ns0:pPr>
-            <ns0:r>
-              <ns0:rPr>
-                <ns0:rFonts ns0:ascii="Arial" ns0:hAnsi="Arial"/>
-                <ns0:color ns0:val="FFFFFF"/>
-              </ns0:rPr>
-              <ns0:t>Value</ns0:t>
-            </ns0:r>
-          </ns0:p>
-        </ns0:tc>
-      </ns0:tr>
-      <ns0:tr ns0:rsidR="00966BE1" ns2:paraId="1A63D356" ns2:textId="77777777" ns0:rsidTr="00966BE1">
-        <ns0:trPr>
-          <ns0:cnfStyle ns0:val="000000100000" ns0:firstRow="0" ns0:lastRow="0" ns0:firstColumn="0" ns0:lastColumn="0" ns0:oddVBand="0" ns0:evenVBand="0" ns0:oddHBand="1" ns0:evenHBand="0" ns0:firstRowFirstColumn="0" ns0:firstRowLastColumn="0" ns0:lastRowFirstColumn="0" ns0:lastRowLastColumn="0"/>
-        </ns0:trPr>
-        <ns0:tc>
-          <ns0:tcPr>
-            <ns0:cnfStyle ns0:val="001000000000" ns0:firstRow="0" ns0:lastRow="0" ns0:firstColumn="1" ns0:lastColumn="0" ns0:oddVBand="0" ns0:evenVBand="0" ns0:oddHBand="0" ns0:evenHBand="0" ns0:firstRowFirstColumn="0" ns0:firstRowLastColumn="0" ns0:lastRowFirstColumn="0" ns0:lastRowLastColumn="0"/>
-            <ns0:tcW ns0:w="3118" ns0:type="dxa"/>
-          </ns0:tcPr>
-          <ns0:p ns2:paraId="7200875F" ns2:textId="77777777" ns0:rsidR="00966BE1" ns0:rsidRDefault="00000000">
-            <ns0:r>
-              <ns0:rPr>
-                <ns0:rFonts ns0:ascii="Arial" ns0:hAnsi="Arial"/>
-                <ns0:sz ns0:val="21"/>
-              </ns0:rPr>
-              <ns0:t>Course:</ns0:t>
-            </ns0:r>
-          </ns0:p>
-        </ns0:tc>
-        <ns0:tc>
-          <ns0:tcPr>
-            <ns0:tcW ns0:w="6520" ns0:type="dxa"/>
-          </ns0:tcPr>
-          <ns0:p ns2:paraId="19562F5D" ns2:textId="555C9562" ns0:rsidR="00966BE1" ns0:rsidRDefault="00000000">
-            <ns0:pPr>
-              <ns0:cnfStyle ns0:val="000000100000" ns0:firstRow="0" ns0:lastRow="0" ns0:firstColumn="0" ns0:lastColumn="0" ns0:oddVBand="0" ns0:evenVBand="0" ns0:oddHBand="1" ns0:evenHBand="0" ns0:firstRowFirstColumn="0" ns0:firstRowLastColumn="0" ns0:lastRowFirstColumn="0" ns0:lastRowLastColumn="0"/>
-            </ns0:pPr>
-            <ns0:r>
-              <ns0:rPr>
-                <ns0:rFonts ns0:ascii="Arial" ns0:hAnsi="Arial"/>
-                <ns0:sz ns0:val="21"/>
-              </ns0:rPr>
-              <ns0:t>CS423 / CSC1</ns0:t>
-            </ns0:r>
-            <ns0:r ns0:rsidR="004C7120">
-              <ns0:rPr>
-                <ns0:rFonts ns0:ascii="Arial" ns0:hAnsi="Arial"/>
-                <ns0:sz ns0:val="21"/>
-              </ns0:rPr>
-              <ns0:t>3</ns0:t>
-            </ns0:r>
-            <ns0:r>
-              <ns0:rPr>
-                <ns0:rFonts ns0:ascii="Arial" ns0:hAnsi="Arial"/>
-                <ns0:sz ns0:val="21"/>
-              </ns0:rPr>
-              <ns0:t>003 – Software Testing</ns0:t>
-            </ns0:r>
-          </ns0:p>
-        </ns0:tc>
-      </ns0:tr>
-      <ns0:tr ns0:rsidR="00966BE1" ns2:paraId="1D66B196" ns2:textId="77777777" ns0:rsidTr="00966BE1">
-        <ns0:trPr>
-          <ns0:cnfStyle ns0:val="000000010000" ns0:firstRow="0" ns0:lastRow="0" ns0:firstColumn="0" ns0:lastColumn="0" ns0:oddVBand="0" ns0:evenVBand="0" ns0:oddHBand="0" ns0:evenHBand="1" ns0:firstRowFirstColumn="0" ns0:firstRowLastColumn="0" ns0:lastRowFirstColumn="0" ns0:lastRowLastColumn="0"/>
-        </ns0:trPr>
-        <ns0:tc>
-          <ns0:tcPr>
-            <ns0:cnfStyle ns0:val="001000000000" ns0:firstRow="0" ns0:lastRow="0" ns0:firstColumn="1" ns0:lastColumn="0" ns0:oddVBand="0" ns0:evenVBand="0" ns0:oddHBand="0" ns0:evenHBand="0" ns0:firstRowFirstColumn="0" ns0:firstRowLastColumn="0" ns0:lastRowFirstColumn="0" ns0:lastRowLastColumn="0"/>
-            <ns0:tcW ns0:w="3118" ns0:type="dxa"/>
-          </ns0:tcPr>
-          <ns0:p ns2:paraId="02AF47D6" ns2:textId="77777777" ns0:rsidR="00966BE1" ns0:rsidRDefault="00000000">
-            <ns0:r>
-              <ns0:rPr>
-                <ns0:rFonts ns0:ascii="Arial" ns0:hAnsi="Arial"/>
-                <ns0:sz ns0:val="21"/>
-              </ns0:rPr>
-              <ns0:t>Assignment ID:</ns0:t>
-            </ns0:r>
-          </ns0:p>
-        </ns0:tc>
-        <ns0:tc>
-          <ns0:tcPr>
-            <ns0:tcW ns0:w="6520" ns0:type="dxa"/>
-          </ns0:tcPr>
-          <ns0:p ns2:paraId="19639C0F" ns2:textId="77777777" ns0:rsidR="00966BE1" ns0:rsidRDefault="00966BE1">
-            <ns0:pPr>
-              <ns0:cnfStyle ns0:val="000000010000" ns0:firstRow="0" ns0:lastRow="0" ns0:firstColumn="0" ns0:lastColumn="0" ns0:oddVBand="0" ns0:evenVBand="0" ns0:oddHBand="0" ns0:evenHBand="1" ns0:firstRowFirstColumn="0" ns0:firstRowLastColumn="0" ns0:lastRowFirstColumn="0" ns0:lastRowLastColumn="0"/>
-            </ns0:pPr>
-            <ns0:r>
-              <ns0:rPr>
-                <ns0:rFonts ns0:ascii="Arial" ns0:hAnsi="Arial"/>
-                <ns0:sz ns0:val="21"/>
-              </ns0:rPr>
-              <ns0:t>HW01 (HW01AI)</ns0:t>
-            </ns0:r>
-          </ns0:p>
-        </ns0:tc>
-      </ns0:tr>
-      <ns0:tr ns0:rsidR="00966BE1" ns2:paraId="22597D27" ns2:textId="77777777" ns0:rsidTr="00966BE1">
-        <ns0:trPr>
-          <ns0:cnfStyle ns0:val="000000100000" ns0:firstRow="0" ns0:lastRow="0" ns0:firstColumn="0" ns0:lastColumn="0" ns0:oddVBand="0" ns0:evenVBand="0" ns0:oddHBand="1" ns0:evenHBand="0" ns0:firstRowFirstColumn="0" ns0:firstRowLastColumn="0" ns0:lastRowFirstColumn="0" ns0:lastRowLastColumn="0"/>
-        </ns0:trPr>
-        <ns0:tc>
-          <ns0:tcPr>
-            <ns0:cnfStyle ns0:val="001000000000" ns0:firstRow="0" ns0:lastRow="0" ns0:firstColumn="1" ns0:lastColumn="0" ns0:oddVBand="0" ns0:evenVBand="0" ns0:oddHBand="0" ns0:evenHBand="0" ns0:firstRowFirstColumn="0" ns0:firstRowLastColumn="0" ns0:lastRowFirstColumn="0" ns0:lastRowLastColumn="0"/>
-            <ns0:tcW ns0:w="3118" ns0:type="dxa"/>
-          </ns0:tcPr>
-          <ns0:p ns2:paraId="07B79293" ns2:textId="77777777" ns0:rsidR="00966BE1" ns0:rsidRDefault="00000000">
-            <ns0:r>
-              <ns0:rPr>
-                <ns0:rFonts ns0:ascii="Arial" ns0:hAnsi="Arial"/>
-                <ns0:sz ns0:val="21"/>
-              </ns0:rPr>
-              <ns0:t>Assignment Title:</ns0:t>
-            </ns0:r>
-          </ns0:p>
-        </ns0:tc>
-        <ns0:tc>
-          <ns0:tcPr>
-            <ns0:tcW ns0:w="6520" ns0:type="dxa"/>
-          </ns0:tcPr>
-          <ns0:p ns2:paraId="287EC508" ns2:textId="77777777" ns0:rsidR="00966BE1" ns0:rsidRDefault="00966BE1">
-            <ns0:pPr>
-              <ns0:cnfStyle ns0:val="000000100000" ns0:firstRow="0" ns0:lastRow="0" ns0:firstColumn="0" ns0:lastColumn="0" ns0:oddVBand="0" ns0:evenVBand="0" ns0:oddHBand="1" ns0:evenHBand="0" ns0:firstRowFirstColumn="0" ns0:firstRowLastColumn="0" ns0:lastRowFirstColumn="0" ns0:lastRowLastColumn="0"/>
-            </ns0:pPr>
-            <ns0:r>
-              <ns0:rPr>
-                <ns0:rFonts ns0:ascii="Arial" ns0:hAnsi="Arial"/>
-                <ns0:sz ns0:val="21"/>
-              </ns0:rPr>
-              <ns0:t>QA/QC Jobs · 20 Defects · Test a Physical Product</ns0:t>
-            </ns0:r>
-          </ns0:p>
-        </ns0:tc>
-      </ns0:tr>
-      <ns0:tr ns0:rsidR="00966BE1" ns2:paraId="62EB4020" ns2:textId="77777777" ns0:rsidTr="00966BE1">
-        <ns0:trPr>
-          <ns0:cnfStyle ns0:val="000000010000" ns0:firstRow="0" ns0:lastRow="0" ns0:firstColumn="0" ns0:lastColumn="0" ns0:oddVBand="0" ns0:evenVBand="0" ns0:oddHBand="0" ns0:evenHBand="1" ns0:firstRowFirstColumn="0" ns0:firstRowLastColumn="0" ns0:lastRowFirstColumn="0" ns0:lastRowLastColumn="0"/>
-        </ns0:trPr>
-        <ns0:tc>
-          <ns0:tcPr>
-            <ns0:cnfStyle ns0:val="001000000000" ns0:firstRow="0" ns0:lastRow="0" ns0:firstColumn="1" ns0:lastColumn="0" ns0:oddVBand="0" ns0:evenVBand="0" ns0:oddHBand="0" ns0:evenHBand="0" ns0:firstRowFirstColumn="0" ns0:firstRowLastColumn="0" ns0:lastRowFirstColumn="0" ns0:lastRowLastColumn="0"/>
-            <ns0:tcW ns0:w="3118" ns0:type="dxa"/>
-          </ns0:tcPr>
-          <ns0:p ns2:paraId="5E231250" ns2:textId="77777777" ns0:rsidR="00966BE1" ns0:rsidRDefault="00000000">
-            <ns0:r>
-              <ns0:rPr>
-                <ns0:rFonts ns0:ascii="Arial" ns0:hAnsi="Arial"/>
-                <ns0:sz ns0:val="21"/>
-              </ns0:rPr>
-              <ns0:t>AI Use Category (1–5):</ns0:t>
-            </ns0:r>
-          </ns0:p>
-        </ns0:tc>
-        <ns0:tc>
-          <ns0:tcPr>
-            <ns0:tcW ns0:w="6520" ns0:type="dxa"/>
-          </ns0:tcPr>
-          <ns0:p ns2:paraId="02827C67" ns2:textId="77777777" ns0:rsidR="00966BE1" ns0:rsidRDefault="00000000">
-            <ns0:pPr>
-              <ns0:cnfStyle ns0:val="000000010000" ns0:firstRow="0" ns0:lastRow="0" ns0:firstColumn="0" ns0:lastColumn="0" ns0:oddVBand="0" ns0:evenVBand="0" ns0:oddHBand="0" ns0:evenHBand="1" ns0:firstRowFirstColumn="0" ns0:firstRowLastColumn="0" ns0:lastRowFirstColumn="0" ns0:lastRowLastColumn="0"/>
-            </ns0:pPr>
-            <ns0:r>
-              <ns0:rPr>
-                <ns0:rFonts ns0:ascii="Arial" ns0:hAnsi="Arial"/>
-                <ns0:sz ns0:val="21"/>
-              </ns0:rPr>
-              <ns0:t>Category 4 – AI-Assisted Production</ns0:t>
-            </ns0:r>
-          </ns0:p>
-        </ns0:tc>
-      </ns0:tr>
-      <ns0:tr ns0:rsidR="00966BE1" ns2:paraId="5E299528" ns2:textId="77777777" ns0:rsidTr="00966BE1">
-        <ns0:trPr>
-          <ns0:cnfStyle ns0:val="000000100000" ns0:firstRow="0" ns0:lastRow="0" ns0:firstColumn="0" ns0:lastColumn="0" ns0:oddVBand="0" ns0:evenVBand="0" ns0:oddHBand="1" ns0:evenHBand="0" ns0:firstRowFirstColumn="0" ns0:firstRowLastColumn="0" ns0:lastRowFirstColumn="0" ns0:lastRowLastColumn="0"/>
-        </ns0:trPr>
-        <ns0:tc>
-          <ns0:tcPr>
-            <ns0:cnfStyle ns0:val="001000000000" ns0:firstRow="0" ns0:lastRow="0" ns0:firstColumn="1" ns0:lastColumn="0" ns0:oddVBand="0" ns0:evenVBand="0" ns0:oddHBand="0" ns0:evenHBand="0" ns0:firstRowFirstColumn="0" ns0:firstRowLastColumn="0" ns0:lastRowFirstColumn="0" ns0:lastRowLastColumn="0"/>
-            <ns0:tcW ns0:w="3118" ns0:type="dxa"/>
-          </ns0:tcPr>
-          <ns0:p ns2:paraId="7607FB1E" ns2:textId="77777777" ns0:rsidR="00966BE1" ns0:rsidRDefault="00000000">
-            <ns0:r>
-              <ns0:rPr>
-                <ns0:rFonts ns0:ascii="Arial" ns0:hAnsi="Arial"/>
-                <ns0:sz ns0:val="21"/>
-              </ns0:rPr>
-              <ns0:t>Date:</ns0:t>
-            </ns0:r>
-          </ns0:p>
-        </ns0:tc>
-        <ns0:tc>
-          <ns0:tcPr>
-            <ns0:tcW ns0:w="6520" ns0:type="dxa"/>
-          </ns0:tcPr>
-          <ns0:p ns2:paraId="2B39A988" ns2:textId="77777777" ns0:rsidR="00966BE1" ns0:rsidRDefault="00966BE1">
-            <ns0:pPr>
-              <ns0:cnfStyle ns0:val="000000100000" ns0:firstRow="0" ns0:lastRow="0" ns0:firstColumn="0" ns0:lastColumn="0" ns0:oddVBand="0" ns0:evenVBand="0" ns0:oddHBand="1" ns0:evenHBand="0" ns0:firstRowFirstColumn="0" ns0:firstRowLastColumn="0" ns0:lastRowFirstColumn="0" ns0:lastRowLastColumn="0"/>
-            </ns0:pPr>
-            <ns0:r>
-              <ns0:rPr>
-                <ns0:rFonts ns0:ascii="Arial" ns0:hAnsi="Arial"/>
-                <ns0:sz ns0:val="21"/>
-              </ns0:rPr>
-              <ns0:t>26/09/2026</ns0:t>
-            </ns0:r>
-          </ns0:p>
-        </ns0:tc>
-      </ns0:tr>
-      <ns0:tr ns0:rsidR="00966BE1" ns2:paraId="51FD36E5" ns2:textId="77777777" ns0:rsidTr="00966BE1">
-        <ns0:trPr>
-          <ns0:cnfStyle ns0:val="000000010000" ns0:firstRow="0" ns0:lastRow="0" ns0:firstColumn="0" ns0:lastColumn="0" ns0:oddVBand="0" ns0:evenVBand="0" ns0:oddHBand="0" ns0:evenHBand="1" ns0:firstRowFirstColumn="0" ns0:firstRowLastColumn="0" ns0:lastRowFirstColumn="0" ns0:lastRowLastColumn="0"/>
-        </ns0:trPr>
-        <ns0:tc>
-          <ns0:tcPr>
-            <ns0:cnfStyle ns0:val="001000000000" ns0:firstRow="0" ns0:lastRow="0" ns0:firstColumn="1" ns0:lastColumn="0" ns0:oddVBand="0" ns0:evenVBand="0" ns0:oddHBand="0" ns0:evenHBand="0" ns0:firstRowFirstColumn="0" ns0:firstRowLastColumn="0" ns0:lastRowFirstColumn="0" ns0:lastRowLastColumn="0"/>
-            <ns0:tcW ns0:w="3118" ns0:type="dxa"/>
-          </ns0:tcPr>
-          <ns0:p ns2:paraId="7C4BF5B2" ns2:textId="77777777" ns0:rsidR="00966BE1" ns0:rsidRDefault="00000000">
-            <ns0:r>
-              <ns0:rPr>
-                <ns0:rFonts ns0:ascii="Arial" ns0:hAnsi="Arial"/>
-                <ns0:sz ns0:val="21"/>
-              </ns0:rPr>
-              <ns0:t>Student name:</ns0:t>
-            </ns0:r>
-          </ns0:p>
-        </ns0:tc>
-        <ns0:tc>
-          <ns0:tcPr>
-            <ns0:tcW ns0:w="6520" ns0:type="dxa"/>
-          </ns0:tcPr>
-          <ns0:p ns2:paraId="091DA986" ns2:textId="77777777" ns0:rsidR="00966BE1" ns0:rsidRDefault="00966BE1">
-            <ns0:pPr>
-              <ns0:cnfStyle ns0:val="000000010000" ns0:firstRow="0" ns0:lastRow="0" ns0:firstColumn="0" ns0:lastColumn="0" ns0:oddVBand="0" ns0:evenVBand="0" ns0:oddHBand="0" ns0:evenHBand="1" ns0:firstRowFirstColumn="0" ns0:firstRowLastColumn="0" ns0:lastRowFirstColumn="0" ns0:lastRowLastColumn="0"/>
-            </ns0:pPr>
-            <ns0:r>
-              <ns0:rPr>
-                <ns0:rFonts ns0:ascii="Arial" ns0:hAnsi="Arial"/>
-                <ns0:sz ns0:val="21"/>
-              </ns0:rPr>
-              <ns0:t>Huỳnh Thái Toàn</ns0:t>
-            </ns0:r>
-          </ns0:p>
-        </ns0:tc>
-      </ns0:tr>
-      <ns0:tr ns0:rsidR="00966BE1" ns2:paraId="001F17D2" ns2:textId="77777777" ns0:rsidTr="00966BE1">
-        <ns0:trPr>
-          <ns0:cnfStyle ns0:val="000000100000" ns0:firstRow="0" ns0:lastRow="0" ns0:firstColumn="0" ns0:lastColumn="0" ns0:oddVBand="0" ns0:evenVBand="0" ns0:oddHBand="1" ns0:evenHBand="0" ns0:firstRowFirstColumn="0" ns0:firstRowLastColumn="0" ns0:lastRowFirstColumn="0" ns0:lastRowLastColumn="0"/>
-        </ns0:trPr>
-        <ns0:tc>
-          <ns0:tcPr>
-            <ns0:cnfStyle ns0:val="001000000000" ns0:firstRow="0" ns0:lastRow="0" ns0:firstColumn="1" ns0:lastColumn="0" ns0:oddVBand="0" ns0:evenVBand="0" ns0:oddHBand="0" ns0:evenHBand="0" ns0:firstRowFirstColumn="0" ns0:firstRowLastColumn="0" ns0:lastRowFirstColumn="0" ns0:lastRowLastColumn="0"/>
-            <ns0:tcW ns0:w="3118" ns0:type="dxa"/>
-          </ns0:tcPr>
-          <ns0:p ns2:paraId="7A2FD863" ns2:textId="77777777" ns0:rsidR="00966BE1" ns0:rsidRDefault="00000000">
-            <ns0:r>
-              <ns0:rPr>
-                <ns0:rFonts ns0:ascii="Arial" ns0:hAnsi="Arial"/>
-                <ns0:sz ns0:val="21"/>
-              </ns0:rPr>
-              <ns0:t>Student ID:</ns0:t>
-            </ns0:r>
-          </ns0:p>
-        </ns0:tc>
-        <ns0:tc>
-          <ns0:tcPr>
-            <ns0:tcW ns0:w="6520" ns0:type="dxa"/>
-          </ns0:tcPr>
-          <ns0:p ns2:paraId="188D4F12" ns2:textId="77777777" ns0:rsidR="00966BE1" ns0:rsidRDefault="00966BE1">
-            <ns0:pPr>
-              <ns0:cnfStyle ns0:val="000000100000" ns0:firstRow="0" ns0:lastRow="0" ns0:firstColumn="0" ns0:lastColumn="0" ns0:oddVBand="0" ns0:evenVBand="0" ns0:oddHBand="1" ns0:evenHBand="0" ns0:firstRowFirstColumn="0" ns0:firstRowLastColumn="0" ns0:lastRowFirstColumn="0" ns0:lastRowLastColumn="0"/>
-            </ns0:pPr>
-            <ns0:r>
-              <ns0:rPr>
-                <ns0:rFonts ns0:ascii="Arial" ns0:hAnsi="Arial"/>
-                <ns0:sz ns0:val="21"/>
-              </ns0:rPr>
-              <ns0:t>23120175</ns0:t>
-            </ns0:r>
-          </ns0:p>
-        </ns0:tc>
-      </ns0:tr>
-    </ns0:tbl>
-    <ns0:p ns2:paraId="43E18232" ns2:textId="77777777" ns0:rsidR="00966BE1" ns0:rsidRDefault="00000000">
-      <ns0:pPr>
-        <ns0:pStyle ns0:val="Heading2"/>
-      </ns0:pPr>
-      <ns0:r>
-        <ns0:rPr>
-          <ns0:rFonts ns0:ascii="Arial" ns0:hAnsi="Arial"/>
-        </ns0:rPr>
-        <ns0:t>2. Disclosure Questions</ns0:t>
-      </ns0:r>
-    </ns0:p>
-    <ns0:p ns2:paraId="3D4C86C4" ns2:textId="77777777" ns0:rsidR="00966BE1" ns0:rsidRDefault="00000000">
-      <ns0:pPr>
-        <ns0:pStyle ns0:val="Heading3"/>
-      </ns0:pPr>
-      <ns0:r>
-        <ns0:rPr>
-          <ns0:rFonts ns0:ascii="Arial" ns0:hAnsi="Arial"/>
-        </ns0:rPr>
-        <ns0:t>1. AI tool(s) used:</ns0:t>
-      </ns0:r>
-    </ns0:p>
-    <ns0:p ns2:paraId="3BDAE3D2" ns2:textId="77777777" ns0:rsidR="00966BE1" ns0:rsidRDefault="00000000">
-      <ns0:r>
-        <ns0:rPr>
-          <ns0:rFonts ns0:ascii="Arial" ns0:hAnsi="Arial"/>
-          <ns0:i/>
-          <ns0:color ns0:val="707070"/>
-          <ns0:sz ns0:val="20"/>
-        </ns0:rPr>
-        <ns0:t>List every AI tool used for this assignment (e.g., AI Tool (e.g., ChatGPT, Claude, Gemini), ChatGPT, GitHub Copilot, Cursor, Gemini).</ns0:t>
-      </ns0:r>
-    </ns0:p>
-    <ns0:p ns2:paraId="5762C83A" ns2:textId="77777777" ns0:rsidR="00966BE1" ns0:rsidRDefault="00000000">
-      <ns0:r>
-        <ns0:rPr>
-          <ns0:rFonts ns0:ascii="Arial" ns0:hAnsi="Arial"/>
-        </ns0:rPr>
-        <ns0:t>ChatGPT (GPT-5.6 Luna), OpenAI – AI explanations of the 20 defects (R2) and the initial test cases for the physical product (R3).</ns0:t>
-      </ns0:r>
-    </ns0:p>
-    <ns0:p ns2:paraId="700E9E96" ns2:textId="77777777" ns0:rsidR="00966BE1" ns0:rsidRDefault="00000000">
-      <ns0:r>
-        <ns0:rPr>
-          <ns0:rFonts ns0:ascii="Arial" ns0:hAnsi="Arial"/>
-        </ns0:rPr>
-        <ns0:t>Cursor Agent (Claude Opus 5.5), Anysphere – the R1 mindmap, research and drafting of the R1 and R2 report text, the refined R3 test suite, and drafts of the AI compliance sections.</ns0:t>
-      </ns0:r>
-    </ns0:p>
-    <ns0:p ns2:paraId="7BE6D574" ns2:textId="77777777" ns0:rsidR="00966BE1" ns0:rsidRDefault="00000000">
-      <ns0:r>
-        <ns0:rPr>
-          <ns0:rFonts ns0:ascii="Arial" ns0:hAnsi="Arial"/>
-        </ns0:rPr>
-        <ns0:t>Codex, OpenAI – reading the assignment and writing the execution plan (PLAN.md) and the first R1 draft on 23/09/2026.</ns0:t>
-      </ns0:r>
-    </ns0:p>
-    <ns0:p ns2:paraId="62DC2ECF" ns2:textId="77777777" ns0:rsidR="00966BE1" ns0:rsidRDefault="00000000">
-      <ns0:pPr>
-        <ns0:pStyle ns0:val="Heading3"/>
-      </ns0:pPr>
-      <ns0:r>
-        <ns0:rPr>
-          <ns0:rFonts ns0:ascii="Arial" ns0:hAnsi="Arial"/>
-        </ns0:rPr>
-        <ns0:t>2. Stage(s) of the assignment where AI was used:</ns0:t>
-      </ns0:r>
-    </ns0:p>
-    <ns0:p ns2:paraId="33FCB136" ns2:textId="77777777" ns0:rsidR="00966BE1" ns0:rsidRDefault="00000000">
-      <ns0:r>
-        <ns0:rPr>
-          <ns0:rFonts ns0:ascii="Arial" ns0:hAnsi="Arial"/>
-        </ns0:rPr>
-        <ns0:t>Tick all that apply: [x] brainstorming  [x] outlining  [x] drafting  [x] feedback  [x] revision  [ ] coding  [ ] data analysis  [x] visual design  [x] other (specify).</ns0:t>
-      </ns0:r>
-    </ns0:p>
-    <ns0:p ns2:paraId="002741AF" ns2:textId="77777777" ns0:rsidR="00966BE1" ns0:rsidRDefault="00000000">
-      <ns0:r>
-        <ns0:rPr>
-          <ns0:rFonts ns0:ascii="Arial" ns0:hAnsi="Arial"/>
-        </ns0:rPr>
-        <ns0:t>Visual design: the R1 mindmap (Mermaid, rendered by Cursor).</ns0:t>
-      </ns0:r>
-    </ns0:p>
-    <ns0:p ns2:paraId="6197B1CF" ns2:textId="77777777" ns0:rsidR="00966BE1" ns0:rsidRDefault="00000000">
-      <ns0:r>
-        <ns0:rPr>
-          <ns0:rFonts ns0:ascii="Arial" ns0:hAnsi="Arial"/>
-        </ns0:rPr>
-        <ns0:t>Other: checking sources and URLs (HTTP status, DNS), formatting the prompt log.</ns0:t>
-      </ns0:r>
-    </ns0:p>
-    <ns0:p ns2:paraId="03FD62FF" ns2:textId="77777777" ns0:rsidR="00966BE1" ns0:rsidRDefault="00000000">
-      <ns0:pPr>
-        <ns0:pStyle ns0:val="Heading3"/>
-      </ns0:pPr>
-      <ns0:r>
-        <ns0:rPr>
-          <ns0:rFonts ns0:ascii="Arial" ns0:hAnsi="Arial"/>
-        </ns0:rPr>
-        <ns0:lastRenderedPageBreak/>
-        <ns0:t>3. Main prompts or tasks given to the AI:</ns0:t>
-      </ns0:r>
-    </ns0:p>
-    <ns0:p ns2:paraId="2ACB7341" ns2:textId="77777777" ns0:rsidR="00966BE1" ns0:rsidRDefault="00000000">
-      <ns0:r>
-        <ns0:rPr>
-          <ns0:rFonts ns0:ascii="Arial" ns0:hAnsi="Arial"/>
-          <ns0:i/>
-          <ns0:color ns0:val="707070"/>
-          <ns0:sz ns0:val="20"/>
-        </ns0:rPr>
-        <ns0:t>Paste the 2–3 most impactful prompts verbatim. For the full transcript, attach Appendix A (prompt_log.md).</ns0:t>
-      </ns0:r>
-    </ns0:p>
-    <ns0:p ns2:paraId="5A115B4E" ns2:textId="77777777" ns0:rsidR="00966BE1" ns0:rsidRDefault="00000000">
-      <ns0:r>
-        <ns0:rPr>
-          <ns0:rFonts ns0:ascii="Arial" ns0:hAnsi="Arial"/>
-        </ns0:rPr>
-        <ns0:t>1. R2-B01 – ChatGPT – 23:19 24/09/2026: "For each of the following 10 software defects, give a 3–4 sentence explanation covering: exact date, root cause, key numbers (affected users/devices/passengers, CVSS score if any), consequences, and the official fix. Add one source link per defect. Format as a numbered list." (followed by the list D01–D10, verbatim in the prompt log)</ns0:t>
-      </ns0:r>
-    </ns0:p>
-    <ns0:p ns2:paraId="138D36FB" ns2:textId="77777777" ns0:rsidR="00966BE1" ns0:rsidRDefault="00000000">
-      <ns0:r>
-        <ns0:rPr>
-          <ns0:rFonts ns0:ascii="Arial" ns0:hAnsi="Arial"/>
-        </ns0:rPr>
-        <ns0:t>2. R3-T02 – ChatGPT – 23:33 26/09/2026: "I am testing a physical household electric fan: Senko B813, manufactured 2014, standing fan. Controls: a rotary speed knob with 4 positions (0 = Off, 1, 2, 3) and a push-pull oscillation knob on the motor housing. Other adjustments: none. Design 15 black-box test cases for this device. For each: ID, Objective, Preconditions, Input, Steps, Expected Result. Cover functional behavior, speed modes, oscillation, usability, reliability and safety. Format as a table."</ns0:t>
-      </ns0:r>
-    </ns0:p>
-    <ns0:p ns2:paraId="2B82FA6D" ns2:textId="77777777" ns0:rsidR="00966BE1" ns0:rsidRDefault="00000000">
-      <ns0:r>
-        <ns0:rPr>
-          <ns0:rFonts ns0:ascii="Arial" ns0:hAnsi="Arial"/>
-        </ns0:rPr>
-        <ns0:t>3. R1-M01 – Cursor Agent – 18:08 24/09/2026: the QA/QC 2026+ mindmap prompt, verbatim in prompt_log.md.</ns0:t>
-      </ns0:r>
-    </ns0:p>
-    <ns0:p ns2:paraId="5ACDE6C3" ns2:textId="77777777" ns0:rsidR="00966BE1" ns0:rsidRDefault="00000000">
-      <ns0:r>
-        <ns0:rPr>
-          <ns0:rFonts ns0:ascii="Arial" ns0:hAnsi="Arial"/>
-        </ns0:rPr>
-        <ns0:t>Appendix A2 (prompt_log.md) contains every prompt used for this assignment, with timestamps.</ns0:t>
-      </ns0:r>
-    </ns0:p>
-    <ns0:p ns2:paraId="779FC1E6" ns2:textId="77777777" ns0:rsidR="00966BE1" ns0:rsidRDefault="00000000">
-      <ns0:pPr>
-        <ns0:pStyle ns0:val="Heading3"/>
-      </ns0:pPr>
-      <ns0:r>
-        <ns0:rPr>
-          <ns0:rFonts ns0:ascii="Arial" ns0:hAnsi="Arial"/>
-        </ns0:rPr>
-        <ns0:t>4. Specific parts of the work AI contributed to:</ns0:t>
-      </ns0:r>
-    </ns0:p>
-    <ns0:p ns2:paraId="46DE9C53" ns2:textId="77777777" ns0:rsidR="00966BE1" ns0:rsidRDefault="00000000">
-      <ns0:r>
-        <ns0:rPr>
-          <ns0:rFonts ns0:ascii="Arial" ns0:hAnsi="Arial"/>
-          <ns0:i/>
-          <ns0:color ns0:val="707070"/>
-          <ns0:sz ns0:val="20"/>
-        </ns0:rPr>
-        <ns0:t>Be specific. Example: 'AI generated TC01–TC15 in Section 3.2; I rewrote TC04 and TC11; AI did NOT contribute to Sections 1, 2, 4, or the AI Critique.'</ns0:t>
-      </ns0:r>
-    </ns0:p>
-    <ns0:p ns2:paraId="651FFB16" ns2:textId="77777777" ns0:rsidR="00966BE1" ns0:rsidRDefault="00000000">
-      <ns0:r>
-        <ns0:rPr>
-          <ns0:rFonts ns0:ascii="Arial" ns0:hAnsi="Arial"/>
-        </ns0:rPr>
-        <ns0:t>R1: Codex wrote the first draft of section 1 (23/09); Cursor revised sections 1.2–1.3 after my review comments. Cursor generated the mindmap (R1_Mindmap/) and later helped identify its 3 mistakes, which I verified against the ISTQB CTFL v4.0.1 syllabus text; the corrected mindmap is in section 1.4. The job-posting screenshots were captured by me.</ns0:t>
-      </ns0:r>
-    </ns0:p>
-    <ns0:p ns2:paraId="281AA567" ns2:textId="77777777" ns0:rsidR="00966BE1" ns0:rsidRDefault="00000000">
-      <ns0:r>
-        <ns0:rPr>
-          <ns0:rFonts ns0:ascii="Arial" ns0:hAnsi="Arial"/>
-        </ns0:rPr>
-        <ns0:t>R2: Cursor researched and drafted sections 2.1–2.3 (20 defect records). ChatGPT produced the explanations in entries R2-B01 to R2-B04; Cursor helped compare them with the sources, and the confirmed errors are recorded in section 2.4.</ns0:t>
-      </ns0:r>
-    </ns0:p>
-    <ns0:p ns2:paraId="21481CBD" ns2:textId="77777777" ns0:rsidR="00966BE1" ns0:rsidRDefault="00000000">
-      <ns0:r>
-        <ns0:rPr>
-          <ns0:rFonts ns0:ascii="Arial" ns0:hAnsi="Arial"/>
-        </ns0:rPr>
-        <ns0:t>R3: ChatGPT generated the initial test cases (R3-T01, R3-T02). Cursor drafted sections 3.1–3.5, including the evaluation of the AI output, the edge cases TC-06, TC-07, TC-10, TC-11 and TC-12, and the "why the AI missed it" explanations. Cursor also built the Excel workbook (checklist items and summary formulas). The device photo, the execution videos, and the Actual result and Verdict columns are my own work.</ns0:t>
-      </ns0:r>
-    </ns0:p>
-    <ns0:p ns2:paraId="66833A9A" ns2:textId="77777777" ns0:rsidR="00966BE1" ns0:rsidRDefault="00000000">
-      <ns0:r>
-        <ns0:rPr>
-          <ns0:rFonts ns0:ascii="Arial" ns0:hAnsi="Arial"/>
-        </ns0:rPr>
-        <ns0:t>AI compliance: Cursor drafted the AI Critique, the Mandatory Disclosure, the AI Audit Report (Appendix A1) and the content of this form and the AI-05 checklist; I reviewed them and completed the personal details and signatures. AI did NOT produce the device photo, the videos, the job-posting screenshots or the prompt log timestamps.</ns0:t>
-      </ns0:r>
-    </ns0:p>
-    <ns0:p ns2:paraId="5CDE8A28" ns2:textId="77777777" ns0:rsidR="00966BE1" ns0:rsidRDefault="00000000">
-      <ns0:pPr>
-        <ns0:pStyle ns0:val="Heading3"/>
-      </ns0:pPr>
-      <ns0:r>
-        <ns0:rPr>
-          <ns0:rFonts ns0:ascii="Arial" ns0:hAnsi="Arial"/>
-        </ns0:rPr>
-        <ns0:lastRenderedPageBreak/>
-        <ns0:t>5. How I reviewed, revised, or verified the AI output:</ns0:t>
-      </ns0:r>
-    </ns0:p>
-    <ns0:p ns2:paraId="6066FECA" ns2:textId="77777777" ns0:rsidR="00966BE1" ns0:rsidRDefault="00000000">
-      <ns0:r>
-        <ns0:rPr>
-          <ns0:rFonts ns0:ascii="Arial" ns0:hAnsi="Arial"/>
-          <ns0:i/>
-          <ns0:color ns0:val="707070"/>
-          <ns0:sz ns0:val="20"/>
-        </ns0:rPr>
-        <ns0:t>Describe your verification method (ran the test, checked the spec, asked the TA, looked up RFC, cross-checked with the ISTQB syllabus, etc.).</ns0:t>
-      </ns0:r>
-    </ns0:p>
-    <ns0:p ns2:paraId="6A49788D" ns2:textId="77777777" ns0:rsidR="00966BE1" ns0:rsidRDefault="00000000">
-      <ns0:r>
-        <ns0:rPr>
-          <ns0:rFonts ns0:ascii="Arial" ns0:hAnsi="Arial"/>
-        </ns0:rPr>
-        <ns0:t>Checked every factual claim in the defect explanations against the primary source (vendor post-incident reports, NVD, regulators, court decisions), including HTTP status and DNS resolution of every cited URL.</ns0:t>
-      </ns0:r>
-    </ns0:p>
-    <ns0:p ns2:paraId="536C0BC6" ns2:textId="77777777" ns0:rsidR="00966BE1" ns0:rsidRDefault="00000000">
-      <ns0:r>
-        <ns0:rPr>
-          <ns0:rFonts ns0:ascii="Arial" ns0:hAnsi="Arial"/>
-        </ns0:rPr>
-        <ns0:t>Compared the AI-generated test cases with the real Senko B813 fan (control type, knob positions, oscillation) and with the black-box techniques of the ISTQB CTFL v4.0 syllabus (§4.2.1–4.2.4, §4.4.1); corrected the control type when both ChatGPT and Cursor assumed piano keys, and re-sent a corrected prompt (R3-T02).</ns0:t>
-      </ns0:r>
-    </ns0:p>
-    <ns0:p ns2:paraId="730C7EFF" ns2:textId="77777777" ns0:rsidR="00966BE1" ns0:rsidRDefault="00000000">
-      <ns0:r>
-        <ns0:rPr>
-          <ns0:rFonts ns0:ascii="Arial" ns0:hAnsi="Arial"/>
-        </ns0:rPr>
-        <ns0:t>Executed TC-04, TC-06, TC-07, TC-08, TC-09, TC-10, TC-11, TC-12 and TC-14 on the Senko B813 on 27/09/2026 and recorded the actual results and verdicts myself.</ns0:t>
-      </ns0:r>
-    </ns0:p>
-    <ns0:p ns2:paraId="4170F532" ns2:textId="77777777" ns0:rsidR="00966BE1" ns0:rsidRDefault="00000000">
-      <ns0:r>
-        <ns0:rPr>
-          <ns0:rFonts ns0:ascii="Arial" ns0:hAnsi="Arial"/>
-        </ns0:rPr>
-        <ns0:t>Tagged every AI artifact VALID / INVALID / INCOMPLETE in the AI Audit Report (AI-02).</ns0:t>
-      </ns0:r>
-    </ns0:p>
-    <ns0:p ns2:paraId="37B2EE6F" ns2:textId="77777777" ns0:rsidR="00966BE1" ns0:rsidRDefault="00000000">
-      <ns0:pPr>
-        <ns0:pStyle ns0:val="Heading3"/>
-      </ns0:pPr>
-      <ns0:r>
-        <ns0:rPr>
-          <ns0:rFonts ns0:ascii="Arial" ns0:hAnsi="Arial"/>
-        </ns0:rPr>
-        <ns0:t>6. Citation (if required by course style guide):</ns0:t>
-      </ns0:r>
-    </ns0:p>
-    <ns0:p ns2:paraId="6671F4A2" ns2:textId="77777777" ns0:rsidR="00966BE1" ns0:rsidRDefault="00000000">
-      <ns0:r>
-        <ns0:rPr>
-          <ns0:rFonts ns0:ascii="Arial" ns0:hAnsi="Arial"/>
-          <ns0:i/>
-          <ns0:color ns0:val="707070"/>
-          <ns0:sz ns0:val="20"/>
-        </ns0:rPr>
-        <ns0:t>Software Testing uses the IEEE style. Example: Anthropic. (2026). AI Tool (e.g., ChatGPT, Claude, Gemini) [Large language model]. https://claude.ai</ns0:t>
-      </ns0:r>
-    </ns0:p>
-    <ns0:p ns2:paraId="3CC2E2AA" ns2:textId="77777777" ns0:rsidR="00966BE1" ns0:rsidRDefault="00000000">
-      <ns0:r>
-        <ns0:rPr>
-          <ns0:rFonts ns0:ascii="Arial" ns0:hAnsi="Arial"/>
-        </ns0:rPr>
-        <ns0:t>[1] OpenAI, "ChatGPT (GPT-5.6 Luna)," large language model, 2026. [Online]. Available: https://chatgpt.com</ns0:t>
-      </ns0:r>
-    </ns0:p>
-    <ns0:p ns2:paraId="257B630C" ns2:textId="77777777" ns0:rsidR="00966BE1" ns0:rsidRDefault="00000000">
-      <ns0:r>
-        <ns0:rPr>
-          <ns0:rFonts ns0:ascii="Arial" ns0:hAnsi="Arial"/>
-        </ns0:rPr>
-        <ns0:t>[2] Anysphere, "Cursor Agent (Claude Opus 5.5)," AI coding agent, 2026. [Online]. Available: https://cursor.com</ns0:t>
-      </ns0:r>
-    </ns0:p>
-    <ns0:p ns2:paraId="09937BB6" ns2:textId="77777777" ns0:rsidR="00966BE1" ns0:rsidRDefault="00000000">
-      <ns0:r>
-        <ns0:rPr>
-          <ns0:rFonts ns0:ascii="Arial" ns0:hAnsi="Arial"/>
-        </ns0:rPr>
-        <ns0:t>[3] OpenAI, "Codex," AI coding agent, 2026. [Online]. Available: https://openai.com/codex</ns0:t>
-      </ns0:r>
-    </ns0:p>
-    <ns0:p ns2:paraId="7A6A9DCC" ns2:textId="77777777" ns0:rsidR="00966BE1" ns0:rsidRDefault="00000000">
-      <ns0:pPr>
-        <ns0:pStyle ns0:val="Heading2"/>
-      </ns0:pPr>
-      <ns0:r>
-        <ns0:rPr>
-          <ns0:rFonts ns0:ascii="Arial" ns0:hAnsi="Arial"/>
-        </ns0:rPr>
-        <ns0:t>3. Statement of Honesty</ns0:t>
-      </ns0:r>
-    </ns0:p>
-    <ns0:p ns2:paraId="67349371" ns2:textId="77777777" ns0:rsidR="00966BE1" ns0:rsidRDefault="00000000">
-      <ns0:r>
-        <ns0:rPr>
-          <ns0:rFonts ns0:ascii="Arial" ns0:hAnsi="Arial"/>
-          <ns0:i/>
-        </ns0:rPr>
-        <ns0:t>By signing below, I confirm that the disclosure above is accurate and complete. I understand that undisclosed or false disclosure of AI use is treated as academic misconduct and may result in a 0 grade for the assignment and disciplinary referral.</ns0:t>
-      </ns0:r>
-    </ns0:p>
-    <ns0:p ns2:paraId="67094B76" ns2:textId="77777777" ns0:rsidR="00966BE1" ns0:rsidRDefault="00000000">
-      <ns0:pPr>
-        <ns0:pStyle ns0:val="Heading2"/>
-      </ns0:pPr>
-      <ns0:r>
-        <ns0:rPr>
-          <ns0:rFonts ns0:ascii="Arial" ns0:hAnsi="Arial"/>
-        </ns0:rPr>
-        <ns0:t>Signature</ns0:t>
-      </ns0:r>
-    </ns0:p>
-    <ns0:tbl>
-      <ns0:tblPr>
-        <ns0:tblStyle ns0:val="LightGrid-Accent1"/>
-        <ns0:tblW ns0:w="0" ns0:type="auto"/>
-        <ns0:tblLayout ns0:type="fixed"/>
-        <ns0:tblLook ns0:val="04A0" ns0:firstRow="1" ns0:lastRow="0" ns0:firstColumn="1" ns0:lastColumn="0" ns0:noHBand="0" ns0:noVBand="1"/>
-      </ns0:tblPr>
-      <ns0:tblGrid>
-        <ns0:gridCol ns0:w="3118"/>
-        <ns0:gridCol ns0:w="6520"/>
-      </ns0:tblGrid>
-      <ns0:tr ns0:rsidR="00966BE1" ns2:paraId="6D6495AB" ns2:textId="77777777" ns0:rsidTr="00966BE1">
-        <ns0:trPr>
-          <ns0:cnfStyle ns0:val="100000000000" ns0:firstRow="1" ns0:lastRow="0" ns0:firstColumn="0" ns0:lastColumn="0" ns0:oddVBand="0" ns0:evenVBand="0" ns0:oddHBand="0" ns0:evenHBand="0" ns0:firstRowFirstColumn="0" ns0:firstRowLastColumn="0" ns0:lastRowFirstColumn="0" ns0:lastRowLastColumn="0"/>
-        </ns0:trPr>
-        <ns0:tc>
-          <ns0:tcPr>
-            <ns0:cnfStyle ns0:val="001000000000" ns0:firstRow="0" ns0:lastRow="0" ns0:firstColumn="1" ns0:lastColumn="0" ns0:oddVBand="0" ns0:evenVBand="0" ns0:oddHBand="0" ns0:evenHBand="0" ns0:firstRowFirstColumn="0" ns0:firstRowLastColumn="0" ns0:lastRowFirstColumn="0" ns0:lastRowLastColumn="0"/>
-            <ns0:tcW ns0:w="3118" ns0:type="dxa"/>
-            <ns0:shd ns0:val="clear" ns0:color="auto" ns0:fill="D9E1F2"/>
-          </ns0:tcPr>
-          <ns0:p ns2:paraId="6AA0DFE8" ns2:textId="77777777" ns0:rsidR="00966BE1" ns0:rsidRDefault="00000000">
-            <ns0:r>
-              <ns0:rPr>
-                <ns0:rFonts ns0:ascii="Arial" ns0:hAnsi="Arial"/>
-                <ns0:sz ns0:val="21"/>
-              </ns0:rPr>
-              <ns0:t>Student name (printed):</ns0:t>
-            </ns0:r>
-          </ns0:p>
-        </ns0:tc>
-        <ns0:tc>
-          <ns0:tcPr>
-            <ns0:tcW ns0:w="6520" ns0:type="dxa"/>
-          </ns0:tcPr>
-          <ns0:p ns2:paraId="38BAB2A7" ns2:textId="77777777" ns0:rsidR="00966BE1" ns0:rsidRDefault="00966BE1">
-            <ns0:pPr>
-              <ns0:cnfStyle ns0:val="100000000000" ns0:firstRow="1" ns0:lastRow="0" ns0:firstColumn="0" ns0:lastColumn="0" ns0:oddVBand="0" ns0:evenVBand="0" ns0:oddHBand="0" ns0:evenHBand="0" ns0:firstRowFirstColumn="0" ns0:firstRowLastColumn="0" ns0:lastRowFirstColumn="0" ns0:lastRowLastColumn="0"/>
-            </ns0:pPr>
-            <ns0:r>
-              <ns0:rPr>
-                <ns0:rFonts ns0:ascii="Arial" ns0:hAnsi="Arial"/>
-                <ns0:sz ns0:val="21"/>
-              </ns0:rPr>
-              <ns0:t>Huỳnh Thái Toàn</ns0:t>
-            </ns0:r>
-          </ns0:p>
-        </ns0:tc>
-      </ns0:tr>
-      <ns0:tr ns0:rsidR="00966BE1" ns2:paraId="31ED0E39" ns2:textId="77777777" ns0:rsidTr="00966BE1">
-        <ns0:trPr>
-          <ns0:cnfStyle ns0:val="000000100000" ns0:firstRow="0" ns0:lastRow="0" ns0:firstColumn="0" ns0:lastColumn="0" ns0:oddVBand="0" ns0:evenVBand="0" ns0:oddHBand="1" ns0:evenHBand="0" ns0:firstRowFirstColumn="0" ns0:firstRowLastColumn="0" ns0:lastRowFirstColumn="0" ns0:lastRowLastColumn="0"/>
-        </ns0:trPr>
-        <ns0:tc>
-          <ns0:tcPr>
-            <ns0:cnfStyle ns0:val="001000000000" ns0:firstRow="0" ns0:lastRow="0" ns0:firstColumn="1" ns0:lastColumn="0" ns0:oddVBand="0" ns0:evenVBand="0" ns0:oddHBand="0" ns0:evenHBand="0" ns0:firstRowFirstColumn="0" ns0:firstRowLastColumn="0" ns0:lastRowFirstColumn="0" ns0:lastRowLastColumn="0"/>
-            <ns0:tcW ns0:w="3118" ns0:type="dxa"/>
-            <ns0:shd ns0:val="clear" ns0:color="auto" ns0:fill="D9E1F2"/>
-          </ns0:tcPr>
-          <ns0:p ns2:paraId="46CEBBA1" ns2:textId="77777777" ns0:rsidR="00966BE1" ns0:rsidRDefault="00000000">
-            <ns0:r>
-              <ns0:rPr>
-                <ns0:rFonts ns0:ascii="Arial" ns0:hAnsi="Arial"/>
-                <ns0:sz ns0:val="21"/>
-              </ns0:rPr>
-              <ns0:t>Student ID:</ns0:t>
-            </ns0:r>
-          </ns0:p>
-        </ns0:tc>
-        <ns0:tc>
-          <ns0:tcPr>
-            <ns0:tcW ns0:w="6520" ns0:type="dxa"/>
-          </ns0:tcPr>
-          <ns0:p ns2:paraId="0400E8BB" ns2:textId="77777777" ns0:rsidR="00966BE1" ns0:rsidRDefault="00966BE1">
-            <ns0:pPr>
-              <ns0:cnfStyle ns0:val="000000100000" ns0:firstRow="0" ns0:lastRow="0" ns0:firstColumn="0" ns0:lastColumn="0" ns0:oddVBand="0" ns0:evenVBand="0" ns0:oddHBand="1" ns0:evenHBand="0" ns0:firstRowFirstColumn="0" ns0:firstRowLastColumn="0" ns0:lastRowFirstColumn="0" ns0:lastRowLastColumn="0"/>
-            </ns0:pPr>
-            <ns0:r>
-              <ns0:rPr>
-                <ns0:rFonts ns0:ascii="Arial" ns0:hAnsi="Arial"/>
-                <ns0:sz ns0:val="21"/>
-              </ns0:rPr>
-              <ns0:t>23120175</ns0:t>
-            </ns0:r>
-          </ns0:p>
-        </ns0:tc>
-      </ns0:tr>
-      <ns0:tr ns0:rsidR="00966BE1" ns2:paraId="426CDD53" ns2:textId="77777777" ns0:rsidTr="00966BE1">
-        <ns0:trPr>
-          <ns0:cnfStyle ns0:val="000000010000" ns0:firstRow="0" ns0:lastRow="0" ns0:firstColumn="0" ns0:lastColumn="0" ns0:oddVBand="0" ns0:evenVBand="0" ns0:oddHBand="0" ns0:evenHBand="1" ns0:firstRowFirstColumn="0" ns0:firstRowLastColumn="0" ns0:lastRowFirstColumn="0" ns0:lastRowLastColumn="0"/>
-        </ns0:trPr>
-        <ns0:tc>
-          <ns0:tcPr>
-            <ns0:cnfStyle ns0:val="001000000000" ns0:firstRow="0" ns0:lastRow="0" ns0:firstColumn="1" ns0:lastColumn="0" ns0:oddVBand="0" ns0:evenVBand="0" ns0:oddHBand="0" ns0:evenHBand="0" ns0:firstRowFirstColumn="0" ns0:firstRowLastColumn="0" ns0:lastRowFirstColumn="0" ns0:lastRowLastColumn="0"/>
-            <ns0:tcW ns0:w="3118" ns0:type="dxa"/>
-            <ns0:shd ns0:val="clear" ns0:color="auto" ns0:fill="D9E1F2"/>
-          </ns0:tcPr>
-          <ns0:p ns2:paraId="6E4774B3" ns2:textId="77777777" ns0:rsidR="00966BE1" ns0:rsidRDefault="00000000">
-            <ns0:r>
-              <ns0:rPr>
-                <ns0:rFonts ns0:ascii="Arial" ns0:hAnsi="Arial"/>
-                <ns0:sz ns0:val="21"/>
-              </ns0:rPr>
-              <ns0:t>Class / Cohort:</ns0:t>
-            </ns0:r>
-          </ns0:p>
-        </ns0:tc>
-        <ns0:tc>
-          <ns0:tcPr>
-            <ns0:tcW ns0:w="6520" ns0:type="dxa"/>
-          </ns0:tcPr>
-          <ns0:p ns2:paraId="4654E89E" ns2:textId="77777777" ns0:rsidR="00966BE1" ns0:rsidRDefault="00966BE1">
-            <ns0:pPr>
-              <ns0:cnfStyle ns0:val="000000010000" ns0:firstRow="0" ns0:lastRow="0" ns0:firstColumn="0" ns0:lastColumn="0" ns0:oddVBand="0" ns0:evenVBand="0" ns0:oddHBand="0" ns0:evenHBand="1" ns0:firstRowFirstColumn="0" ns0:firstRowLastColumn="0" ns0:lastRowFirstColumn="0" ns0:lastRowLastColumn="0"/>
-            </ns0:pPr>
-            <ns0:r>
-              <ns0:rPr>
-                <ns0:rFonts ns0:ascii="Arial" ns0:hAnsi="Arial"/>
-                <ns0:sz ns0:val="21"/>
-              </ns0:rPr>
-              <ns0:t>CQ2023/31</ns0:t>
-            </ns0:r>
-          </ns0:p>
-        </ns0:tc>
-      </ns0:tr>
-      <ns0:tr ns0:rsidR="00966BE1" ns2:paraId="3B86D5EA" ns2:textId="77777777" ns0:rsidTr="00966BE1">
-        <ns0:trPr>
-          <ns0:cnfStyle ns0:val="000000100000" ns0:firstRow="0" ns0:lastRow="0" ns0:firstColumn="0" ns0:lastColumn="0" ns0:oddVBand="0" ns0:evenVBand="0" ns0:oddHBand="1" ns0:evenHBand="0" ns0:firstRowFirstColumn="0" ns0:firstRowLastColumn="0" ns0:lastRowFirstColumn="0" ns0:lastRowLastColumn="0"/>
-        </ns0:trPr>
-        <ns0:tc>
-          <ns0:tcPr>
-            <ns0:cnfStyle ns0:val="001000000000" ns0:firstRow="0" ns0:lastRow="0" ns0:firstColumn="1" ns0:lastColumn="0" ns0:oddVBand="0" ns0:evenVBand="0" ns0:oddHBand="0" ns0:evenHBand="0" ns0:firstRowFirstColumn="0" ns0:firstRowLastColumn="0" ns0:lastRowFirstColumn="0" ns0:lastRowLastColumn="0"/>
-            <ns0:tcW ns0:w="3118" ns0:type="dxa"/>
-            <ns0:shd ns0:val="clear" ns0:color="auto" ns0:fill="D9E1F2"/>
-          </ns0:tcPr>
-          <ns0:p ns2:paraId="65739084" ns2:textId="77777777" ns0:rsidR="00966BE1" ns0:rsidRDefault="00000000">
-            <ns0:r>
-              <ns0:rPr>
-                <ns0:rFonts ns0:ascii="Arial" ns0:hAnsi="Arial"/>
-                <ns0:sz ns0:val="21"/>
-              </ns0:rPr>
-              <ns0:t>Course:</ns0:t>
-            </ns0:r>
-          </ns0:p>
-        </ns0:tc>
-        <ns0:tc>
-          <ns0:tcPr>
-            <ns0:tcW ns0:w="6520" ns0:type="dxa"/>
-          </ns0:tcPr>
-          <ns0:p ns2:paraId="1D7C1037" ns2:textId="2342C880" ns0:rsidR="00966BE1" ns0:rsidRDefault="00000000">
-            <ns0:pPr>
-              <ns0:cnfStyle ns0:val="000000100000" ns0:firstRow="0" ns0:lastRow="0" ns0:firstColumn="0" ns0:lastColumn="0" ns0:oddVBand="0" ns0:evenVBand="0" ns0:oddHBand="1" ns0:evenHBand="0" ns0:firstRowFirstColumn="0" ns0:firstRowLastColumn="0" ns0:lastRowFirstColumn="0" ns0:lastRowLastColumn="0"/>
-            </ns0:pPr>
-            <ns0:r>
-              <ns0:rPr>
-                <ns0:rFonts ns0:ascii="Arial" ns0:hAnsi="Arial"/>
-                <ns0:sz ns0:val="21"/>
-              </ns0:rPr>
-              <ns0:t>Software Testing</ns0:t>
-            </ns0:r>
-          </ns0:p>
-        </ns0:tc>
-      </ns0:tr>
-      <ns0:tr ns0:rsidR="00966BE1" ns2:paraId="3AC2F23E" ns2:textId="77777777" ns0:rsidTr="00966BE1">
-        <ns0:trPr>
-          <ns0:cnfStyle ns0:val="000000010000" ns0:firstRow="0" ns0:lastRow="0" ns0:firstColumn="0" ns0:lastColumn="0" ns0:oddVBand="0" ns0:evenVBand="0" ns0:oddHBand="0" ns0:evenHBand="1" ns0:firstRowFirstColumn="0" ns0:firstRowLastColumn="0" ns0:lastRowFirstColumn="0" ns0:lastRowLastColumn="0"/>
-        </ns0:trPr>
-        <ns0:tc>
-          <ns0:tcPr>
-            <ns0:cnfStyle ns0:val="001000000000" ns0:firstRow="0" ns0:lastRow="0" ns0:firstColumn="1" ns0:lastColumn="0" ns0:oddVBand="0" ns0:evenVBand="0" ns0:oddHBand="0" ns0:evenHBand="0" ns0:firstRowFirstColumn="0" ns0:firstRowLastColumn="0" ns0:lastRowFirstColumn="0" ns0:lastRowLastColumn="0"/>
-            <ns0:tcW ns0:w="3118" ns0:type="dxa"/>
-            <ns0:shd ns0:val="clear" ns0:color="auto" ns0:fill="D9E1F2"/>
-          </ns0:tcPr>
-          <ns0:p ns2:paraId="3EC933DF" ns2:textId="77777777" ns0:rsidR="00966BE1" ns0:rsidRDefault="00000000">
-            <ns0:r>
-              <ns0:rPr>
-                <ns0:rFonts ns0:ascii="Arial" ns0:hAnsi="Arial"/>
-                <ns0:sz ns0:val="21"/>
-              </ns0:rPr>
-              <ns0:t>Instructor:</ns0:t>
-            </ns0:r>
-          </ns0:p>
-        </ns0:tc>
-        <ns0:tc>
-          <ns0:tcPr>
-            <ns0:tcW ns0:w="6520" ns0:type="dxa"/>
-          </ns0:tcPr>
-          <ns0:p ns2:paraId="47D7BEE3" ns2:textId="77777777" ns0:rsidR="00966BE1" ns0:rsidRDefault="00966BE1">
-            <ns0:pPr>
-              <ns0:cnfStyle ns0:val="000000010000" ns0:firstRow="0" ns0:lastRow="0" ns0:firstColumn="0" ns0:lastColumn="0" ns0:oddVBand="0" ns0:evenVBand="0" ns0:oddHBand="0" ns0:evenHBand="1" ns0:firstRowFirstColumn="0" ns0:firstRowLastColumn="0" ns0:lastRowFirstColumn="0" ns0:lastRowLastColumn="0"/>
-            </ns0:pPr>
-            <ns0:r>
-              <ns0:rPr>
-                <ns0:rFonts ns0:ascii="Arial" ns0:hAnsi="Arial"/>
-                <ns0:sz ns0:val="21"/>
-              </ns0:rPr>
-              <ns0:t>MSc. Trần Thị Bích Hạnh</ns0:t>
-            </ns0:r>
-          </ns0:p>
-        </ns0:tc>
-      </ns0:tr>
-      <ns0:tr ns0:rsidR="00966BE1" ns2:paraId="7814E6D6" ns2:textId="77777777" ns0:rsidTr="00966BE1">
-        <ns0:trPr>
-          <ns0:cnfStyle ns0:val="000000100000" ns0:firstRow="0" ns0:lastRow="0" ns0:firstColumn="0" ns0:lastColumn="0" ns0:oddVBand="0" ns0:evenVBand="0" ns0:oddHBand="1" ns0:evenHBand="0" ns0:firstRowFirstColumn="0" ns0:firstRowLastColumn="0" ns0:lastRowFirstColumn="0" ns0:lastRowLastColumn="0"/>
-        </ns0:trPr>
-        <ns0:tc>
-          <ns0:tcPr>
-            <ns0:cnfStyle ns0:val="001000000000" ns0:firstRow="0" ns0:lastRow="0" ns0:firstColumn="1" ns0:lastColumn="0" ns0:oddVBand="0" ns0:evenVBand="0" ns0:oddHBand="0" ns0:evenHBand="0" ns0:firstRowFirstColumn="0" ns0:firstRowLastColumn="0" ns0:lastRowFirstColumn="0" ns0:lastRowLastColumn="0"/>
-            <ns0:tcW ns0:w="3118" ns0:type="dxa"/>
-            <ns0:shd ns0:val="clear" ns0:color="auto" ns0:fill="D9E1F2"/>
-          </ns0:tcPr>
-          <ns0:p ns2:paraId="63D3FDF4" ns2:textId="77777777" ns0:rsidR="00966BE1" ns0:rsidRDefault="00000000">
-            <ns0:r>
-              <ns0:rPr>
-                <ns0:rFonts ns0:ascii="Arial" ns0:hAnsi="Arial"/>
-                <ns0:sz ns0:val="21"/>
-              </ns0:rPr>
-              <ns0:t>Date:</ns0:t>
-            </ns0:r>
-          </ns0:p>
-        </ns0:tc>
-        <ns0:tc>
-          <ns0:tcPr>
-            <ns0:tcW ns0:w="6520" ns0:type="dxa"/>
-          </ns0:tcPr>
-          <ns0:p ns2:paraId="56C253C7" ns2:textId="77777777" ns0:rsidR="00966BE1" ns0:rsidRDefault="00966BE1">
-            <ns0:pPr>
-              <ns0:cnfStyle ns0:val="000000100000" ns0:firstRow="0" ns0:lastRow="0" ns0:firstColumn="0" ns0:lastColumn="0" ns0:oddVBand="0" ns0:evenVBand="0" ns0:oddHBand="1" ns0:evenHBand="0" ns0:firstRowFirstColumn="0" ns0:firstRowLastColumn="0" ns0:lastRowFirstColumn="0" ns0:lastRowLastColumn="0"/>
-            </ns0:pPr>
-            <ns0:r>
-              <ns0:rPr>
-                <ns0:rFonts ns0:ascii="Arial" ns0:hAnsi="Arial"/>
-                <ns0:sz ns0:val="21"/>
-              </ns0:rPr>
-              <ns0:t>27/09/2026</ns0:t>
-            </ns0:r>
-          </ns0:p>
-        </ns0:tc>
-      </ns0:tr>
-      <ns0:tr ns0:rsidR="00966BE1" ns2:paraId="73F73076" ns2:textId="77777777" ns0:rsidTr="00966BE1">
-        <ns0:trPr>
-          <ns0:cnfStyle ns0:val="000000010000" ns0:firstRow="0" ns0:lastRow="0" ns0:firstColumn="0" ns0:lastColumn="0" ns0:oddVBand="0" ns0:evenVBand="0" ns0:oddHBand="0" ns0:evenHBand="1" ns0:firstRowFirstColumn="0" ns0:firstRowLastColumn="0" ns0:lastRowFirstColumn="0" ns0:lastRowLastColumn="0"/>
-        </ns0:trPr>
-        <ns0:tc>
-          <ns0:tcPr>
-            <ns0:cnfStyle ns0:val="001000000000" ns0:firstRow="0" ns0:lastRow="0" ns0:firstColumn="1" ns0:lastColumn="0" ns0:oddVBand="0" ns0:evenVBand="0" ns0:oddHBand="0" ns0:evenHBand="0" ns0:firstRowFirstColumn="0" ns0:firstRowLastColumn="0" ns0:lastRowFirstColumn="0" ns0:lastRowLastColumn="0"/>
-            <ns0:tcW ns0:w="3118" ns0:type="dxa"/>
-            <ns0:shd ns0:val="clear" ns0:color="auto" ns0:fill="D9E1F2"/>
-          </ns0:tcPr>
-          <ns0:p ns2:paraId="54E88F02" ns2:textId="77777777" ns0:rsidR="00966BE1" ns0:rsidRDefault="00000000">
-            <ns0:r>
-              <ns0:rPr>
-                <ns0:rFonts ns0:ascii="Arial" ns0:hAnsi="Arial"/>
-                <ns0:sz ns0:val="21"/>
-              </ns0:rPr>
-              <ns0:t>Signature:</ns0:t>
-            </ns0:r>
-          </ns0:p>
-        </ns0:tc>
-        <ns0:tc>
-          <ns0:tcPr>
-            <ns0:tcW ns0:w="6520" ns0:type="dxa"/>
-          </ns0:tcPr>
-          <ns0:p ns2:paraId="78C335E3" ns2:textId="6C03ABE3" ns0:rsidR="00966BE1" ns0:rsidRDefault="001713E6">
-            <ns0:pPr>
-              <ns0:cnfStyle ns0:val="000000010000" ns0:firstRow="0" ns0:lastRow="0" ns0:firstColumn="0" ns0:lastColumn="0" ns0:oddVBand="0" ns0:evenVBand="0" ns0:oddHBand="0" ns0:evenHBand="1" ns0:firstRowFirstColumn="0" ns0:firstRowLastColumn="0" ns0:lastRowFirstColumn="0" ns0:lastRowLastColumn="0"/>
-            </ns0:pPr>
-            <ns0:r>
-              <ns0:rPr>
-                <ns0:rFonts ns0:ascii="Arial" ns0:hAnsi="Arial"/>
-                <ns0:sz ns0:val="21"/>
-              </ns0:rPr>
-              <ns0:t>Huỳnh Thái Toàn</ns0:t>
-            </ns0:r>
-            <ns0:r>
-              <ns0:rPr>
-                <ns0:rFonts ns0:ascii="Myriad Pro" ns0:hAnsi="Myriad Pro" ns0:cs="Tahoma"/>
-                <ns0:lang ns0:eastAsia="vi-VN"/>
-              </ns0:rPr>
-              <ns0:drawing>
-                <ns3:inline distT="0" distB="0" distL="0" distR="0" ns4:anchorId="63E61BDF" ns4:editId="0DC83652">
-                  <ns3:extent cx="781235" cy="415290"/>
-                  <ns3:effectExtent l="0" t="0" r="0" b="3810"/>
-                  <ns3:docPr id="1018047995" name="Picture 2"/>
-                  <ns3:cNvGraphicFramePr>
-                    <ns5:graphicFrameLocks noChangeAspect="1"/>
-                  </ns3:cNvGraphicFramePr>
-                  <ns5:graphic>
-                    <ns5:graphicData uri="http://schemas.openxmlformats.org/drawingml/2006/picture">
-                      <ns6:pic>
-                        <ns6:nvPicPr>
-                          <ns6:cNvPr id="1018047995" name="Picture 2"/>
-                          <ns6:cNvPicPr/>
-                        </ns6:nvPicPr>
-                        <ns6:blipFill rotWithShape="1">
-                          <ns5:blip ns7:embed="rId6" cstate="print">
-                            <ns5:duotone>
-                              <ns5:schemeClr val="accent1">
-                                <ns5:shade val="45000"/>
-                                <ns5:satMod val="135000"/>
-                              </ns5:schemeClr>
-                              <ns5:prstClr val="white"/>
-                            </ns5:duotone>
-                            <ns5:extLst>
-                              <ns5:ext uri="{28A0092B-C50C-407E-A947-70E740481C1C}">
-                                <ns8:useLocalDpi val="0"/>
-                              </ns5:ext>
-                            </ns5:extLst>
-                          </ns5:blip>
-                          <ns5:srcRect l="7270" t="22563" r="16482" b="25379"/>
-                          <ns5:stretch>
-                            <ns5:fillRect/>
-                          </ns5:stretch>
-                        </ns6:blipFill>
-                        <ns6:spPr bwMode="auto">
-                          <ns5:xfrm>
-                            <ns5:off x="0" y="0"/>
-                            <ns5:ext cx="856562" cy="455332"/>
-                          </ns5:xfrm>
-                          <ns5:prstGeom prst="rect">
-                            <ns5:avLst/>
-                          </ns5:prstGeom>
-                          <ns5:ln>
-                            <ns5:noFill/>
-                          </ns5:ln>
-                          <ns5:extLst>
-                            <ns5:ext uri="{53640926-AAD7-44D8-BBD7-CCE9431645EC}">
-                              <ns8:shadowObscured/>
-                            </ns5:ext>
-                          </ns5:extLst>
-                        </ns6:spPr>
-                      </ns6:pic>
-                    </ns5:graphicData>
-                  </ns5:graphic>
-                </ns3:inline>
-              </ns0:drawing>
-            </ns0:r>
-          </ns0:p>
-        </ns0:tc>
-      </ns0:tr>
-    </ns0:tbl>
-    <ns0:p ns2:paraId="6D0B0764" ns2:textId="77777777" ns0:rsidR="00966BE1" ns0:rsidRDefault="00000000">
-      <ns0:pPr>
-        <ns0:pStyle ns0:val="Heading2"/>
-      </ns0:pPr>
-      <ns0:r>
-        <ns0:rPr>
-          <ns0:rFonts ns0:ascii="Arial" ns0:hAnsi="Arial"/>
-        </ns0:rPr>
-        <ns0:lastRenderedPageBreak/>
-        <ns0:t>References</ns0:t>
-      </ns0:r>
-    </ns0:p>
-    <ns0:p ns2:paraId="5B277027" ns2:textId="77777777" ns0:rsidR="00966BE1" ns0:rsidRDefault="00000000">
-      <ns0:pPr>
-        <ns0:pStyle ns0:val="ListBullet"/>
-      </ns0:pPr>
-      <ns0:r>
-        <ns0:rPr>
-          <ns0:rFonts ns0:ascii="Arial" ns0:hAnsi="Arial"/>
-        </ns0:rPr>
-        <ns0:t>Kharbach, M. (2026). AI Use Policy Templates for Higher Education. CC BY-NC-SA 4.0.</ns0:t>
-      </ns0:r>
-    </ns0:p>
-    <ns0:p ns2:paraId="13066681" ns2:textId="77777777" ns0:rsidR="00966BE1" ns0:rsidRDefault="00000000">
-      <ns0:pPr>
-        <ns0:pStyle ns0:val="ListBullet"/>
-      </ns0:pPr>
-      <ns0:r>
-        <ns0:rPr>
-          <ns0:rFonts ns0:ascii="Arial" ns0:hAnsi="Arial"/>
-        </ns0:rPr>
-        <ns0:t>ISTQB Foundation Level Syllabus (latest version).</ns0:t>
-      </ns0:r>
-    </ns0:p>
-    <ns0:p ns2:paraId="779730A3" ns2:textId="77777777" ns0:rsidR="00966BE1" ns0:rsidRDefault="00000000">
-      <ns0:pPr>
-        <ns0:pStyle ns0:val="ListBullet"/>
-      </ns0:pPr>
-      <ns0:r>
-        <ns0:rPr>
-          <ns0:rFonts ns0:ascii="Arial" ns0:hAnsi="Arial"/>
-        </ns0:rPr>
-        <ns0:t>Hardman, P. (2025). A Post-AI Learning Taxonomy.</ns0:t>
-      </ns0:r>
-    </ns0:p>
-    <ns0:p ns2:paraId="7E31CBE1" ns2:textId="77777777" ns0:rsidR="00966BE1" ns0:rsidRDefault="00000000">
-      <ns0:pPr>
-        <ns0:pStyle ns0:val="ListBullet"/>
-      </ns0:pPr>
-      <ns0:r>
-        <ns0:rPr>
-          <ns0:rFonts ns0:ascii="Arial" ns0:hAnsi="Arial"/>
-        </ns0:rPr>
-        <ns0:t>Fuster Rabella, M. (2025). OECD Education Working Paper No. 338.</ns0:t>
-      </ns0:r>
-    </ns0:p>
-    <ns0:p ns2:paraId="576781E1" ns2:textId="77777777" ns0:rsidR="00966BE1" ns0:rsidRDefault="00000000">
-      <ns0:pPr>
-        <ns0:pStyle ns0:val="ListBullet"/>
-      </ns0:pPr>
-      <ns0:r>
-        <ns0:rPr>
-          <ns0:rFonts ns0:ascii="Arial" ns0:hAnsi="Arial"/>
-        </ns0:rPr>
-        <ns0:t>Perkins, M., Roe, J., &amp; Furze, L. (2025). AI Assessment Scale.</ns0:t>
-      </ns0:r>
-    </ns0:p>
-    <ns0:p ns2:paraId="38EE7A6B" ns2:textId="77777777" ns0:rsidR="00966BE1" ns0:rsidRDefault="00000000">
-      <ns0:pPr>
-        <ns0:pStyle ns0:val="ListBullet"/>
-      </ns0:pPr>
-      <ns0:r>
-        <ns0:rPr>
-          <ns0:rFonts ns0:ascii="Arial" ns0:hAnsi="Arial"/>
-        </ns0:rPr>
-        <ns0:t>Anthropic (2025). Building reliable AI test agents — engineering blog.</ns0:t>
-      </ns0:r>
-    </ns0:p>
-    <ns0:p ns2:paraId="2FDB2101" ns2:textId="77777777" ns0:rsidR="00966BE1" ns0:rsidRDefault="00000000">
-      <ns0:pPr>
-        <ns0:pStyle ns0:val="ListBullet"/>
-      </ns0:pPr>
-      <ns0:r>
-        <ns0:rPr>
-          <ns0:rFonts ns0:ascii="Arial" ns0:hAnsi="Arial"/>
-        </ns0:rPr>
-        <ns0:t>DeepEval &amp; Promptfoo documentation — testing frameworks for LLM systems.</ns0:t>
-      </ns0:r>
-    </ns0:p>
-    <ns0:sectPr ns0:rsidR="00966BE1" ns0:rsidSect="00034616">
-      <ns0:pgSz ns0:w="12240" ns0:h="15840"/>
-      <ns0:pgMar ns0:top="1440" ns0:right="1800" ns0:bottom="1440" ns0:left="1800" ns0:header="720" ns0:footer="720" ns0:gutter="0"/>
-      <ns0:cols ns0:space="720"/>
-      <ns0:docGrid ns0:linePitch="360"/>
-    </ns0:sectPr>
-  </ns0:body>
-</ns0:document>
+<w:document xmlns:wpc="http://schemas.microsoft.com/office/word/2010/wordprocessingCanvas" xmlns:cx="http://schemas.microsoft.com/office/drawing/2014/chartex" xmlns:cx1="http://schemas.microsoft.com/office/drawing/2015/9/8/chartex" xmlns:cx2="http://schemas.microsoft.com/office/drawing/2015/10/21/chartex" xmlns:cx3="http://schemas.microsoft.com/office/drawing/2016/5/9/chartex" xmlns:cx4="http://schemas.microsoft.com/office/drawing/2016/5/10/chartex" xmlns:cx5="http://schemas.microsoft.com/office/drawing/2016/5/11/chartex" xmlns:cx6="http://schemas.microsoft.com/office/drawing/2016/5/12/chartex" xmlns:cx7="http://schemas.microsoft.com/office/drawing/2016/5/13/chartex" xmlns:cx8="http://schemas.microsoft.com/office/drawing/2016/5/14/chartex" xmlns:mc="http://schemas.openxmlformats.org/markup-compatibility/2006" xmlns:m="http://schemas.openxmlformats.org/officeDocument/2006/math" xmlns:aink="http://schemas.microsoft.com/office/drawing/2016/ink" xmlns:am3d="http://schemas.microsoft.com/office/drawing/2017/model3d" xmlns:oel="http://schemas.microsoft.com/office/2019/extlst" xmlns:r="http://schemas.openxmlformats.org/officeDocument/2006/relationships" xmlns:wp14="http://schemas.microsoft.com/office/word/2010/wordprocessingDrawing" xmlns:wp="http://schemas.openxmlformats.org/drawingml/2006/wordprocessingDrawing" xmlns:wpg="http://schemas.microsoft.com/office/word/2010/wordprocessingGroup" xmlns:wpi="http://schemas.microsoft.com/office/word/2010/wordprocessingInk" xmlns:wps="http://schemas.microsoft.com/office/word/2010/wordprocessingShape" xmlns:o="urn:schemas-microsoft-com:office:office" xmlns:v="urn:schemas-microsoft-com:vml" xmlns:w10="urn:schemas-microsoft-com:office:word" xmlns:w="http://schemas.openxmlformats.org/wordprocessingml/2006/main" xmlns:w14="http://schemas.microsoft.com/office/word/2010/wordml" xmlns:w15="http://schemas.microsoft.com/office/word/2012/wordml" xmlns:w16cex="http://schemas.microsoft.com/office/word/2018/wordml/cex" xmlns:w16cid="http://schemas.microsoft.com/office/word/2016/wordml/cid" xmlns:w16="http://schemas.microsoft.com/office/word/2018/wordml" xmlns:w16sdtdh="http://schemas.microsoft.com/office/word/2020/wordml/sdtdatahash" xmlns:w16sdtfl="http://schemas.microsoft.com/office/word/2024/wordml/sdtformatlock" xmlns:w16se="http://schemas.microsoft.com/office/word/2015/wordml/symex" xmlns:w16du="http://schemas.microsoft.com/office/word/2023/wordml/word16du" xmlns:wne="http://schemas.microsoft.com/office/word/2006/wordml" mc:Ignorable="w14 w15 w16se w16cid w16 w16cex w16sdtdh w16sdtfl w16du wp14">
+  <w:body>
+    <w:p>
+      <w:pPr>
+        <w:jc w:val="center"/>
+      </w:pPr>
+      <w:r>
+        <w:rPr>
+          <w:rFonts w:ascii="Arial" w:hAnsi="Arial"/>
+          <w:b/>
+        </w:rPr>
+        <w:t>Faculty of Information Technology (FIT) – Ho Chi Minh City University of Science (HCMUS)</w:t>
+      </w:r>
+    </w:p>
+    <w:p>
+      <w:pPr>
+        <w:jc w:val="center"/>
+      </w:pPr>
+      <w:r>
+        <w:rPr>
+          <w:rFonts w:ascii="Arial" w:hAnsi="Arial"/>
+          <w:b/>
+        </w:rPr>
+        <w:t>CS423 / CSC1</w:t>
+      </w:r>
+      <w:r>
+        <w:rPr>
+          <w:rFonts w:ascii="Arial" w:hAnsi="Arial"/>
+          <w:b/>
+        </w:rPr>
+        <w:t>3</w:t>
+      </w:r>
+      <w:r>
+        <w:rPr>
+          <w:rFonts w:ascii="Arial" w:hAnsi="Arial"/>
+          <w:b/>
+        </w:rPr>
+        <w:t>003 – Software Testing (AI-augmented · 2026)</w:t>
+      </w:r>
+    </w:p>
+    <w:p>
+      <w:pPr>
+        <w:jc w:val="center"/>
+      </w:pPr>
+      <w:r>
+        <w:rPr>
+          <w:rFonts w:ascii="Arial" w:hAnsi="Arial"/>
+          <w:b/>
+          <w:color w:val="C00000"/>
+          <w:sz w:val="20"/>
+        </w:rPr>
+        <w:t>AI POLICY · TEMPLATES — 2026 v1.0</w:t>
+      </w:r>
+    </w:p>
+    <w:p>
+      <w:pPr>
+        <w:pStyle w:val="Heading1"/>
+      </w:pPr>
+      <w:r>
+        <w:rPr>
+          <w:rFonts w:ascii="Arial" w:hAnsi="Arial"/>
+        </w:rPr>
+        <w:t>AI Use Disclosure Form</w:t>
+      </w:r>
+    </w:p>
+    <w:p>
+      <w:r>
+        <w:rPr>
+          <w:rFonts w:ascii="Arial" w:hAnsi="Arial"/>
+          <w:i/>
+        </w:rPr>
+        <w:t>Attach to assignments where AI was used in any permitted capacity.</w:t>
+      </w:r>
+    </w:p>
+    <w:p>
+      <w:r>
+        <w:rPr>
+          <w:rFonts w:ascii="Arial" w:hAnsi="Arial"/>
+          <w:i/>
+          <w:color w:val="707070"/>
+          <w:sz w:val="18"/>
+        </w:rPr>
+        <w:t>Adapted from Med Kharbach, PhD (2026) — AI Use Policy Templates for Higher Education. CC BY-NC-SA 4.0. This adaptation is prepared for FIT@HCMUS – CS423 / CSC15003 Software Testing course.</w:t>
+      </w:r>
+    </w:p>
+    <w:p>
+      <w:pPr>
+        <w:pStyle w:val="Heading2"/>
+      </w:pPr>
+      <w:r>
+        <w:rPr>
+          <w:rFonts w:ascii="Arial" w:hAnsi="Arial"/>
+        </w:rPr>
+        <w:t>1. Course &amp; Student Info</w:t>
+      </w:r>
+    </w:p>
+    <w:tbl>
+      <w:tblPr>
+        <w:tblStyle w:val="LightGrid-Accent1"/>
+        <w:tblW w:w="0" w:type="auto"/>
+        <w:tblLayout w:type="fixed"/>
+        <w:tblLook w:val="04A0" w:firstRow="1" w:lastRow="0" w:firstColumn="1" w:lastColumn="0" w:noHBand="0" w:noVBand="1"/>
+      </w:tblPr>
+      <w:tblGrid>
+        <w:gridCol w:w="3118"/>
+        <w:gridCol w:w="6520"/>
+      </w:tblGrid>
+      <w:tr>
+        <w:trPr>
+          <w:cnfStyle w:val="100000000000" w:firstRow="1" w:lastRow="0" w:firstColumn="0" w:lastColumn="0" w:oddVBand="0" w:evenVBand="0" w:oddHBand="0" w:evenHBand="0" w:firstRowFirstColumn="0" w:firstRowLastColumn="0" w:lastRowFirstColumn="0" w:lastRowLastColumn="0"/>
+        </w:trPr>
+        <w:tc>
+          <w:tcPr>
+            <w:cnfStyle w:val="001000000000" w:firstRow="0" w:lastRow="0" w:firstColumn="1" w:lastColumn="0" w:oddVBand="0" w:evenVBand="0" w:oddHBand="0" w:evenHBand="0" w:firstRowFirstColumn="0" w:firstRowLastColumn="0" w:lastRowFirstColumn="0" w:lastRowLastColumn="0"/>
+            <w:tcW w:w="3118" w:type="dxa"/>
+            <w:shd w:val="clear" w:color="auto" w:fill="1F4E79"/>
+            <w:vAlign w:val="center"/>
+          </w:tcPr>
+          <w:p>
+            <w:r>
+              <w:rPr>
+                <w:rFonts w:ascii="Arial" w:hAnsi="Arial"/>
+                <w:color w:val="FFFFFF"/>
+              </w:rPr>
+              <w:t>Field</w:t>
+            </w:r>
+          </w:p>
+        </w:tc>
+        <w:tc>
+          <w:tcPr>
+            <w:tcW w:w="6520" w:type="dxa"/>
+            <w:shd w:val="clear" w:color="auto" w:fill="1F4E79"/>
+            <w:vAlign w:val="center"/>
+          </w:tcPr>
+          <w:p>
+            <w:pPr>
+              <w:cnfStyle w:val="100000000000" w:firstRow="1" w:lastRow="0" w:firstColumn="0" w:lastColumn="0" w:oddVBand="0" w:evenVBand="0" w:oddHBand="0" w:evenHBand="0" w:firstRowFirstColumn="0" w:firstRowLastColumn="0" w:lastRowFirstColumn="0" w:lastRowLastColumn="0"/>
+            </w:pPr>
+            <w:r>
+              <w:rPr>
+                <w:rFonts w:ascii="Arial" w:hAnsi="Arial"/>
+                <w:color w:val="FFFFFF"/>
+              </w:rPr>
+              <w:t>Value</w:t>
+            </w:r>
+          </w:p>
+        </w:tc>
+      </w:tr>
+      <w:tr>
+        <w:trPr>
+          <w:cnfStyle w:val="000000100000" w:firstRow="0" w:lastRow="0" w:firstColumn="0" w:lastColumn="0" w:oddVBand="0" w:evenVBand="0" w:oddHBand="1" w:evenHBand="0" w:firstRowFirstColumn="0" w:firstRowLastColumn="0" w:lastRowFirstColumn="0" w:lastRowLastColumn="0"/>
+        </w:trPr>
+        <w:tc>
+          <w:tcPr>
+            <w:cnfStyle w:val="001000000000" w:firstRow="0" w:lastRow="0" w:firstColumn="1" w:lastColumn="0" w:oddVBand="0" w:evenVBand="0" w:oddHBand="0" w:evenHBand="0" w:firstRowFirstColumn="0" w:firstRowLastColumn="0" w:lastRowFirstColumn="0" w:lastRowLastColumn="0"/>
+            <w:tcW w:w="3118" w:type="dxa"/>
+          </w:tcPr>
+          <w:p>
+            <w:r>
+              <w:rPr>
+                <w:rFonts w:ascii="Arial" w:hAnsi="Arial"/>
+                <w:sz w:val="21"/>
+              </w:rPr>
+              <w:t>Course:</w:t>
+            </w:r>
+          </w:p>
+        </w:tc>
+        <w:tc>
+          <w:tcPr>
+            <w:tcW w:w="6520" w:type="dxa"/>
+          </w:tcPr>
+          <w:p>
+            <w:pPr>
+              <w:cnfStyle w:val="000000100000" w:firstRow="0" w:lastRow="0" w:firstColumn="0" w:lastColumn="0" w:oddVBand="0" w:evenVBand="0" w:oddHBand="1" w:evenHBand="0" w:firstRowFirstColumn="0" w:firstRowLastColumn="0" w:lastRowFirstColumn="0" w:lastRowLastColumn="0"/>
+            </w:pPr>
+            <w:r>
+              <w:rPr>
+                <w:rFonts w:ascii="Arial" w:hAnsi="Arial"/>
+                <w:sz w:val="21"/>
+              </w:rPr>
+              <w:t>CS423 / CSC1</w:t>
+            </w:r>
+            <w:r>
+              <w:rPr>
+                <w:rFonts w:ascii="Arial" w:hAnsi="Arial"/>
+                <w:sz w:val="21"/>
+              </w:rPr>
+              <w:t>3</w:t>
+            </w:r>
+            <w:r>
+              <w:rPr>
+                <w:rFonts w:ascii="Arial" w:hAnsi="Arial"/>
+                <w:sz w:val="21"/>
+              </w:rPr>
+              <w:t>003 – Software Testing</w:t>
+            </w:r>
+          </w:p>
+        </w:tc>
+      </w:tr>
+      <w:tr>
+        <w:trPr>
+          <w:cnfStyle w:val="000000010000" w:firstRow="0" w:lastRow="0" w:firstColumn="0" w:lastColumn="0" w:oddVBand="0" w:evenVBand="0" w:oddHBand="0" w:evenHBand="1" w:firstRowFirstColumn="0" w:firstRowLastColumn="0" w:lastRowFirstColumn="0" w:lastRowLastColumn="0"/>
+        </w:trPr>
+        <w:tc>
+          <w:tcPr>
+            <w:cnfStyle w:val="001000000000" w:firstRow="0" w:lastRow="0" w:firstColumn="1" w:lastColumn="0" w:oddVBand="0" w:evenVBand="0" w:oddHBand="0" w:evenHBand="0" w:firstRowFirstColumn="0" w:firstRowLastColumn="0" w:lastRowFirstColumn="0" w:lastRowLastColumn="0"/>
+            <w:tcW w:w="3118" w:type="dxa"/>
+          </w:tcPr>
+          <w:p>
+            <w:r>
+              <w:rPr>
+                <w:rFonts w:ascii="Arial" w:hAnsi="Arial"/>
+                <w:sz w:val="21"/>
+              </w:rPr>
+              <w:t>Assignment ID:</w:t>
+            </w:r>
+          </w:p>
+        </w:tc>
+        <w:tc>
+          <w:tcPr>
+            <w:tcW w:w="6520" w:type="dxa"/>
+          </w:tcPr>
+          <w:p>
+            <w:pPr>
+              <w:cnfStyle w:val="000000010000" w:firstRow="0" w:lastRow="0" w:firstColumn="0" w:lastColumn="0" w:oddVBand="0" w:evenVBand="0" w:oddHBand="0" w:evenHBand="1" w:firstRowFirstColumn="0" w:firstRowLastColumn="0" w:lastRowFirstColumn="0" w:lastRowLastColumn="0"/>
+            </w:pPr>
+            <w:r>
+              <w:rPr>
+                <w:rFonts w:ascii="Arial" w:hAnsi="Arial"/>
+                <w:sz w:val="21"/>
+              </w:rPr>
+              <w:t>HW01 (HW01AI)</w:t>
+            </w:r>
+          </w:p>
+        </w:tc>
+      </w:tr>
+      <w:tr>
+        <w:trPr>
+          <w:cnfStyle w:val="000000100000" w:firstRow="0" w:lastRow="0" w:firstColumn="0" w:lastColumn="0" w:oddVBand="0" w:evenVBand="0" w:oddHBand="1" w:evenHBand="0" w:firstRowFirstColumn="0" w:firstRowLastColumn="0" w:lastRowFirstColumn="0" w:lastRowLastColumn="0"/>
+        </w:trPr>
+        <w:tc>
+          <w:tcPr>
+            <w:cnfStyle w:val="001000000000" w:firstRow="0" w:lastRow="0" w:firstColumn="1" w:lastColumn="0" w:oddVBand="0" w:evenVBand="0" w:oddHBand="0" w:evenHBand="0" w:firstRowFirstColumn="0" w:firstRowLastColumn="0" w:lastRowFirstColumn="0" w:lastRowLastColumn="0"/>
+            <w:tcW w:w="3118" w:type="dxa"/>
+          </w:tcPr>
+          <w:p>
+            <w:r>
+              <w:rPr>
+                <w:rFonts w:ascii="Arial" w:hAnsi="Arial"/>
+                <w:sz w:val="21"/>
+              </w:rPr>
+              <w:t>Assignment Title:</w:t>
+            </w:r>
+          </w:p>
+        </w:tc>
+        <w:tc>
+          <w:tcPr>
+            <w:tcW w:w="6520" w:type="dxa"/>
+          </w:tcPr>
+          <w:p>
+            <w:pPr>
+              <w:cnfStyle w:val="000000100000" w:firstRow="0" w:lastRow="0" w:firstColumn="0" w:lastColumn="0" w:oddVBand="0" w:evenVBand="0" w:oddHBand="1" w:evenHBand="0" w:firstRowFirstColumn="0" w:firstRowLastColumn="0" w:lastRowFirstColumn="0" w:lastRowLastColumn="0"/>
+            </w:pPr>
+            <w:r>
+              <w:rPr>
+                <w:rFonts w:ascii="Arial" w:hAnsi="Arial"/>
+                <w:sz w:val="21"/>
+              </w:rPr>
+              <w:t>QA/QC Jobs · 20 Defects · Test a Physical Product</w:t>
+            </w:r>
+          </w:p>
+        </w:tc>
+      </w:tr>
+      <w:tr>
+        <w:trPr>
+          <w:cnfStyle w:val="000000010000" w:firstRow="0" w:lastRow="0" w:firstColumn="0" w:lastColumn="0" w:oddVBand="0" w:evenVBand="0" w:oddHBand="0" w:evenHBand="1" w:firstRowFirstColumn="0" w:firstRowLastColumn="0" w:lastRowFirstColumn="0" w:lastRowLastColumn="0"/>
+        </w:trPr>
+        <w:tc>
+          <w:tcPr>
+            <w:cnfStyle w:val="001000000000" w:firstRow="0" w:lastRow="0" w:firstColumn="1" w:lastColumn="0" w:oddVBand="0" w:evenVBand="0" w:oddHBand="0" w:evenHBand="0" w:firstRowFirstColumn="0" w:firstRowLastColumn="0" w:lastRowFirstColumn="0" w:lastRowLastColumn="0"/>
+            <w:tcW w:w="3118" w:type="dxa"/>
+          </w:tcPr>
+          <w:p>
+            <w:r>
+              <w:rPr>
+                <w:rFonts w:ascii="Arial" w:hAnsi="Arial"/>
+                <w:sz w:val="21"/>
+              </w:rPr>
+              <w:t>AI Use Category (1–5):</w:t>
+            </w:r>
+          </w:p>
+        </w:tc>
+        <w:tc>
+          <w:tcPr>
+            <w:tcW w:w="6520" w:type="dxa"/>
+          </w:tcPr>
+          <w:p>
+            <w:pPr>
+              <w:cnfStyle w:val="000000010000" w:firstRow="0" w:lastRow="0" w:firstColumn="0" w:lastColumn="0" w:oddVBand="0" w:evenVBand="0" w:oddHBand="0" w:evenHBand="1" w:firstRowFirstColumn="0" w:firstRowLastColumn="0" w:lastRowFirstColumn="0" w:lastRowLastColumn="0"/>
+            </w:pPr>
+            <w:r>
+              <w:rPr>
+                <w:rFonts w:ascii="Arial" w:hAnsi="Arial"/>
+                <w:sz w:val="21"/>
+              </w:rPr>
+              <w:t>Category 4 – AI-Assisted Production</w:t>
+            </w:r>
+          </w:p>
+        </w:tc>
+      </w:tr>
+      <w:tr>
+        <w:trPr>
+          <w:cnfStyle w:val="000000100000" w:firstRow="0" w:lastRow="0" w:firstColumn="0" w:lastColumn="0" w:oddVBand="0" w:evenVBand="0" w:oddHBand="1" w:evenHBand="0" w:firstRowFirstColumn="0" w:firstRowLastColumn="0" w:lastRowFirstColumn="0" w:lastRowLastColumn="0"/>
+        </w:trPr>
+        <w:tc>
+          <w:tcPr>
+            <w:cnfStyle w:val="001000000000" w:firstRow="0" w:lastRow="0" w:firstColumn="1" w:lastColumn="0" w:oddVBand="0" w:evenVBand="0" w:oddHBand="0" w:evenHBand="0" w:firstRowFirstColumn="0" w:firstRowLastColumn="0" w:lastRowFirstColumn="0" w:lastRowLastColumn="0"/>
+            <w:tcW w:w="3118" w:type="dxa"/>
+          </w:tcPr>
+          <w:p>
+            <w:r>
+              <w:rPr>
+                <w:rFonts w:ascii="Arial" w:hAnsi="Arial"/>
+                <w:sz w:val="21"/>
+              </w:rPr>
+              <w:t>Date:</w:t>
+            </w:r>
+          </w:p>
+        </w:tc>
+        <w:tc>
+          <w:tcPr>
+            <w:tcW w:w="6520" w:type="dxa"/>
+          </w:tcPr>
+          <w:p>
+            <w:pPr>
+              <w:cnfStyle w:val="000000100000" w:firstRow="0" w:lastRow="0" w:firstColumn="0" w:lastColumn="0" w:oddVBand="0" w:evenVBand="0" w:oddHBand="1" w:evenHBand="0" w:firstRowFirstColumn="0" w:firstRowLastColumn="0" w:lastRowFirstColumn="0" w:lastRowLastColumn="0"/>
+            </w:pPr>
+            <w:r>
+              <w:rPr>
+                <w:rFonts w:ascii="Arial" w:hAnsi="Arial"/>
+                <w:sz w:val="21"/>
+              </w:rPr>
+              <w:t>26/09/2026</w:t>
+            </w:r>
+          </w:p>
+        </w:tc>
+      </w:tr>
+      <w:tr>
+        <w:trPr>
+          <w:cnfStyle w:val="000000010000" w:firstRow="0" w:lastRow="0" w:firstColumn="0" w:lastColumn="0" w:oddVBand="0" w:evenVBand="0" w:oddHBand="0" w:evenHBand="1" w:firstRowFirstColumn="0" w:firstRowLastColumn="0" w:lastRowFirstColumn="0" w:lastRowLastColumn="0"/>
+        </w:trPr>
+        <w:tc>
+          <w:tcPr>
+            <w:cnfStyle w:val="001000000000" w:firstRow="0" w:lastRow="0" w:firstColumn="1" w:lastColumn="0" w:oddVBand="0" w:evenVBand="0" w:oddHBand="0" w:evenHBand="0" w:firstRowFirstColumn="0" w:firstRowLastColumn="0" w:lastRowFirstColumn="0" w:lastRowLastColumn="0"/>
+            <w:tcW w:w="3118" w:type="dxa"/>
+          </w:tcPr>
+          <w:p>
+            <w:r>
+              <w:rPr>
+                <w:rFonts w:ascii="Arial" w:hAnsi="Arial"/>
+                <w:sz w:val="21"/>
+              </w:rPr>
+              <w:t>Student name:</w:t>
+            </w:r>
+          </w:p>
+        </w:tc>
+        <w:tc>
+          <w:tcPr>
+            <w:tcW w:w="6520" w:type="dxa"/>
+          </w:tcPr>
+          <w:p>
+            <w:pPr>
+              <w:cnfStyle w:val="000000010000" w:firstRow="0" w:lastRow="0" w:firstColumn="0" w:lastColumn="0" w:oddVBand="0" w:evenVBand="0" w:oddHBand="0" w:evenHBand="1" w:firstRowFirstColumn="0" w:firstRowLastColumn="0" w:lastRowFirstColumn="0" w:lastRowLastColumn="0"/>
+            </w:pPr>
+            <w:r>
+              <w:rPr>
+                <w:rFonts w:ascii="Arial" w:hAnsi="Arial"/>
+                <w:sz w:val="21"/>
+              </w:rPr>
+              <w:t>Huỳnh Thái Toàn</w:t>
+            </w:r>
+          </w:p>
+        </w:tc>
+      </w:tr>
+      <w:tr>
+        <w:trPr>
+          <w:cnfStyle w:val="000000100000" w:firstRow="0" w:lastRow="0" w:firstColumn="0" w:lastColumn="0" w:oddVBand="0" w:evenVBand="0" w:oddHBand="1" w:evenHBand="0" w:firstRowFirstColumn="0" w:firstRowLastColumn="0" w:lastRowFirstColumn="0" w:lastRowLastColumn="0"/>
+        </w:trPr>
+        <w:tc>
+          <w:tcPr>
+            <w:cnfStyle w:val="001000000000" w:firstRow="0" w:lastRow="0" w:firstColumn="1" w:lastColumn="0" w:oddVBand="0" w:evenVBand="0" w:oddHBand="0" w:evenHBand="0" w:firstRowFirstColumn="0" w:firstRowLastColumn="0" w:lastRowFirstColumn="0" w:lastRowLastColumn="0"/>
+            <w:tcW w:w="3118" w:type="dxa"/>
+          </w:tcPr>
+          <w:p>
+            <w:r>
+              <w:rPr>
+                <w:rFonts w:ascii="Arial" w:hAnsi="Arial"/>
+                <w:sz w:val="21"/>
+              </w:rPr>
+              <w:t>Student ID:</w:t>
+            </w:r>
+          </w:p>
+        </w:tc>
+        <w:tc>
+          <w:tcPr>
+            <w:tcW w:w="6520" w:type="dxa"/>
+          </w:tcPr>
+          <w:p>
+            <w:pPr>
+              <w:cnfStyle w:val="000000100000" w:firstRow="0" w:lastRow="0" w:firstColumn="0" w:lastColumn="0" w:oddVBand="0" w:evenVBand="0" w:oddHBand="1" w:evenHBand="0" w:firstRowFirstColumn="0" w:firstRowLastColumn="0" w:lastRowFirstColumn="0" w:lastRowLastColumn="0"/>
+            </w:pPr>
+            <w:r>
+              <w:rPr>
+                <w:rFonts w:ascii="Arial" w:hAnsi="Arial"/>
+                <w:sz w:val="21"/>
+              </w:rPr>
+              <w:t>23120175</w:t>
+            </w:r>
+          </w:p>
+        </w:tc>
+      </w:tr>
+    </w:tbl>
+    <w:p>
+      <w:pPr>
+        <w:pStyle w:val="Heading2"/>
+      </w:pPr>
+      <w:r>
+        <w:rPr>
+          <w:rFonts w:ascii="Arial" w:hAnsi="Arial"/>
+        </w:rPr>
+        <w:t>2. Disclosure Questions</w:t>
+      </w:r>
+    </w:p>
+    <w:p>
+      <w:pPr>
+        <w:pStyle w:val="Heading3"/>
+      </w:pPr>
+      <w:r>
+        <w:rPr>
+          <w:rFonts w:ascii="Arial" w:hAnsi="Arial"/>
+        </w:rPr>
+        <w:t>1. AI tool(s) used:</w:t>
+      </w:r>
+    </w:p>
+    <w:p>
+      <w:r>
+        <w:rPr>
+          <w:rFonts w:ascii="Arial" w:hAnsi="Arial"/>
+          <w:i/>
+          <w:color w:val="707070"/>
+          <w:sz w:val="20"/>
+        </w:rPr>
+        <w:t>List every AI tool used for this assignment (e.g., AI Tool (e.g., ChatGPT, Claude, Gemini), ChatGPT, GitHub Copilot, Cursor, Gemini).</w:t>
+      </w:r>
+    </w:p>
+    <w:p>
+      <w:r>
+        <w:rPr>
+          <w:rFonts w:ascii="Arial" w:hAnsi="Arial"/>
+        </w:rPr>
+        <w:t>ChatGPT (GPT-5.6 Luna), OpenAI – AI explanations of the 20 defects (R2) and the initial test cases for the physical product (R3).</w:t>
+      </w:r>
+    </w:p>
+    <w:p>
+      <w:r>
+        <w:rPr>
+          <w:rFonts w:ascii="Arial" w:hAnsi="Arial"/>
+        </w:rPr>
+        <w:t>Cursor Agent (Claude Opus 5.5), Anysphere – the R1 mindmap, research and drafting of the R1 and R2 report text, the refined R3 test suite, and drafts of the AI compliance sections.</w:t>
+      </w:r>
+    </w:p>
+    <w:p>
+      <w:r>
+        <w:rPr>
+          <w:rFonts w:ascii="Arial" w:hAnsi="Arial"/>
+        </w:rPr>
+        <w:t>Codex, OpenAI – reading the assignment and writing the execution plan (PLAN.md) and the first R1 draft on 23/09/2026.</w:t>
+      </w:r>
+    </w:p>
+    <w:p>
+      <w:pPr>
+        <w:pStyle w:val="Heading3"/>
+      </w:pPr>
+      <w:r>
+        <w:rPr>
+          <w:rFonts w:ascii="Arial" w:hAnsi="Arial"/>
+        </w:rPr>
+        <w:t>2. Stage(s) of the assignment where AI was used:</w:t>
+      </w:r>
+    </w:p>
+    <w:p>
+      <w:r>
+        <w:rPr>
+          <w:rFonts w:ascii="Arial" w:hAnsi="Arial"/>
+        </w:rPr>
+        <w:t>Tick all that apply: [x] brainstorming  [x] outlining  [x] drafting  [x] feedback  [x] revision  [ ] coding  [ ] data analysis  [x] visual design  [x] other (specify).</w:t>
+      </w:r>
+    </w:p>
+    <w:p>
+      <w:r>
+        <w:rPr>
+          <w:rFonts w:ascii="Arial" w:hAnsi="Arial"/>
+        </w:rPr>
+        <w:t>Visual design: the R1 mindmap (Mermaid, rendered by Cursor).</w:t>
+      </w:r>
+    </w:p>
+    <w:p>
+      <w:r>
+        <w:rPr>
+          <w:rFonts w:ascii="Arial" w:hAnsi="Arial"/>
+        </w:rPr>
+        <w:t>Other: checking sources and URLs (HTTP status, DNS), formatting the prompt log.</w:t>
+      </w:r>
+    </w:p>
+    <w:p>
+      <w:pPr>
+        <w:pStyle w:val="Heading3"/>
+      </w:pPr>
+      <w:r>
+        <w:rPr>
+          <w:rFonts w:ascii="Arial" w:hAnsi="Arial"/>
+        </w:rPr>
+        <w:lastRenderedPageBreak/>
+        <w:t>3. Main prompts or tasks given to the AI:</w:t>
+      </w:r>
+    </w:p>
+    <w:p>
+      <w:r>
+        <w:rPr>
+          <w:rFonts w:ascii="Arial" w:hAnsi="Arial"/>
+          <w:i/>
+          <w:color w:val="707070"/>
+          <w:sz w:val="20"/>
+        </w:rPr>
+        <w:t>Paste the 2–3 most impactful prompts verbatim. For the full transcript, attach Appendix A (prompt_log.md).</w:t>
+      </w:r>
+    </w:p>
+    <w:p>
+      <w:r>
+        <w:rPr>
+          <w:rFonts w:ascii="Arial" w:hAnsi="Arial"/>
+        </w:rPr>
+        <w:t>1. R2-B01 – ChatGPT – 23:19 24/09/2026: "For each of the following 10 software defects, give a 3–4 sentence explanation covering: exact date, root cause, key numbers (affected users/devices/passengers, CVSS score if any), consequences, and the official fix. Add one source link per defect. Format as a numbered list." (followed by the list D01–D10, verbatim in the prompt log)</w:t>
+      </w:r>
+    </w:p>
+    <w:p>
+      <w:r>
+        <w:rPr>
+          <w:rFonts w:ascii="Arial" w:hAnsi="Arial"/>
+        </w:rPr>
+        <w:t>2. R3-T02 – ChatGPT – 23:33 26/09/2026: "I am testing a physical household electric fan: Senko B813, manufactured 2014, standing fan. Controls: a rotary speed knob with 4 positions (0 = Off, 1, 2, 3) and a push-pull oscillation knob on the motor housing. Other adjustments: none. Design 15 black-box test cases for this device. For each: ID, Objective, Preconditions, Input, Steps, Expected Result. Cover functional behavior, speed modes, oscillation, usability, reliability and safety. Format as a table."</w:t>
+      </w:r>
+    </w:p>
+    <w:p>
+      <w:r>
+        <w:rPr>
+          <w:rFonts w:ascii="Arial" w:hAnsi="Arial"/>
+        </w:rPr>
+        <w:t>3. R1-M01 – Cursor Agent – 18:08 24/09/2026: the QA/QC 2026+ mindmap prompt, verbatim in prompt_log.md.</w:t>
+      </w:r>
+    </w:p>
+    <w:p>
+      <w:r>
+        <w:rPr>
+          <w:rFonts w:ascii="Arial" w:hAnsi="Arial"/>
+        </w:rPr>
+        <w:t>Appendix A2 (prompt_log.md) contains every prompt used for this assignment, with timestamps.</w:t>
+      </w:r>
+    </w:p>
+    <w:p>
+      <w:pPr>
+        <w:pStyle w:val="Heading3"/>
+      </w:pPr>
+      <w:r>
+        <w:rPr>
+          <w:rFonts w:ascii="Arial" w:hAnsi="Arial"/>
+        </w:rPr>
+        <w:t>4. Specific parts of the work AI contributed to:</w:t>
+      </w:r>
+    </w:p>
+    <w:p>
+      <w:r>
+        <w:rPr>
+          <w:rFonts w:ascii="Arial" w:hAnsi="Arial"/>
+          <w:i/>
+          <w:color w:val="707070"/>
+          <w:sz w:val="20"/>
+        </w:rPr>
+        <w:t>Be specific. Example: 'AI generated TC01–TC15 in Section 3.2; I rewrote TC04 and TC11; AI did NOT contribute to Sections 1, 2, 4, or the AI Critique.'</w:t>
+      </w:r>
+    </w:p>
+    <w:p>
+      <w:r>
+        <w:rPr>
+          <w:rFonts w:ascii="Arial" w:hAnsi="Arial"/>
+        </w:rPr>
+        <w:t>R1: Codex wrote the first draft of section 1 (23/09); Cursor revised sections 1.2–1.3 after my review comments. Cursor generated the mindmap (R1_Mindmap/) and later helped identify its 3 mistakes, which I verified against the ISTQB CTFL v4.0.1 syllabus text; the corrected mindmap is in section 1.4. The job-posting screenshots were captured by me.</w:t>
+      </w:r>
+    </w:p>
+    <w:p>
+      <w:r>
+        <w:rPr>
+          <w:rFonts w:ascii="Arial" w:hAnsi="Arial"/>
+        </w:rPr>
+        <w:t>R2: Cursor researched and drafted sections 2.1–2.3 (20 defect records). ChatGPT produced the explanations in entries R2-B01 to R2-B04; Cursor helped compare them with the sources, and the confirmed errors are recorded in section 2.4.</w:t>
+      </w:r>
+    </w:p>
+    <w:p>
+      <w:r>
+        <w:rPr>
+          <w:rFonts w:ascii="Arial" w:hAnsi="Arial"/>
+        </w:rPr>
+        <w:t>R3: ChatGPT generated the initial test cases (R3-T01, R3-T02). Cursor drafted sections 3.1–3.5, including the evaluation of the AI output, the edge cases TC-06, TC-07, TC-10, TC-11 and TC-12, and the "why the AI missed it" explanations. Cursor also built the Excel workbook (checklist items and summary formulas). The device photo, the execution videos, and the Actual result and Verdict columns are my own work.</w:t>
+      </w:r>
+    </w:p>
+    <w:p>
+      <w:r>
+        <w:rPr>
+          <w:rFonts w:ascii="Arial" w:hAnsi="Arial"/>
+        </w:rPr>
+        <w:t>AI compliance: Cursor drafted the AI Critique, the Mandatory Disclosure, the AI Audit Report (Appendix A1) and the content of this form and the AI-05 checklist; I reviewed them and completed the personal details and signatures. AI did NOT produce the device photo, the videos, the job-posting screenshots or the prompt log timestamps.</w:t>
+      </w:r>
+    </w:p>
+    <w:p>
+      <w:pPr>
+        <w:pStyle w:val="Heading3"/>
+      </w:pPr>
+      <w:r>
+        <w:rPr>
+          <w:rFonts w:ascii="Arial" w:hAnsi="Arial"/>
+        </w:rPr>
+        <w:lastRenderedPageBreak/>
+        <w:t>5. How I reviewed, revised, or verified the AI output:</w:t>
+      </w:r>
+    </w:p>
+    <w:p>
+      <w:r>
+        <w:rPr>
+          <w:rFonts w:ascii="Arial" w:hAnsi="Arial"/>
+          <w:i/>
+          <w:color w:val="707070"/>
+          <w:sz w:val="20"/>
+        </w:rPr>
+        <w:t>Describe your verification method (ran the test, checked the spec, asked the TA, looked up RFC, cross-checked with the ISTQB syllabus, etc.).</w:t>
+      </w:r>
+    </w:p>
+    <w:p>
+      <w:r>
+        <w:rPr>
+          <w:rFonts w:ascii="Arial" w:hAnsi="Arial"/>
+        </w:rPr>
+        <w:t>Checked every factual claim in the defect explanations against the primary source (vendor post-incident reports, NVD, regulators, court decisions), including HTTP status and DNS resolution of every cited URL.</w:t>
+      </w:r>
+    </w:p>
+    <w:p>
+      <w:r>
+        <w:rPr>
+          <w:rFonts w:ascii="Arial" w:hAnsi="Arial"/>
+        </w:rPr>
+        <w:t>Compared the AI-generated test cases with the real Senko B813 fan (control type, knob positions, oscillation) and with the black-box techniques of the ISTQB CTFL v4.0 syllabus (§4.2.1–4.2.4, §4.4.1); corrected the control type when both ChatGPT and Cursor assumed piano keys, and re-sent a corrected prompt (R3-T02).</w:t>
+      </w:r>
+    </w:p>
+    <w:p>
+      <w:r>
+        <w:rPr>
+          <w:rFonts w:ascii="Arial" w:hAnsi="Arial"/>
+        </w:rPr>
+        <w:t>Executed TC-04, TC-06, TC-07, TC-08, TC-09, TC-10, TC-11, TC-12 and TC-14 on the Senko B813 on 27/09/2026 and recorded the actual results and verdicts myself.</w:t>
+      </w:r>
+    </w:p>
+    <w:p>
+      <w:r>
+        <w:rPr>
+          <w:rFonts w:ascii="Arial" w:hAnsi="Arial"/>
+        </w:rPr>
+        <w:t>Tagged every AI artifact VALID / INVALID / INCOMPLETE in the AI Audit Report (AI-02).</w:t>
+      </w:r>
+    </w:p>
+    <w:p>
+      <w:pPr>
+        <w:pStyle w:val="Heading3"/>
+      </w:pPr>
+      <w:r>
+        <w:rPr>
+          <w:rFonts w:ascii="Arial" w:hAnsi="Arial"/>
+        </w:rPr>
+        <w:t>6. Citation (if required by course style guide):</w:t>
+      </w:r>
+    </w:p>
+    <w:p>
+      <w:r>
+        <w:rPr>
+          <w:rFonts w:ascii="Arial" w:hAnsi="Arial"/>
+          <w:i/>
+          <w:color w:val="707070"/>
+          <w:sz w:val="20"/>
+        </w:rPr>
+        <w:t>Software Testing uses the IEEE style. Example: Anthropic. (2026). AI Tool (e.g., ChatGPT, Claude, Gemini) [Large language model]. https://claude.ai</w:t>
+      </w:r>
+    </w:p>
+    <w:p>
+      <w:r>
+        <w:rPr>
+          <w:rFonts w:ascii="Arial" w:hAnsi="Arial"/>
+        </w:rPr>
+        <w:t>[1] OpenAI, "ChatGPT (GPT-5.6 Luna)," large language model, 2026. [Online]. Available: https://chatgpt.com</w:t>
+      </w:r>
+    </w:p>
+    <w:p>
+      <w:r>
+        <w:rPr>
+          <w:rFonts w:ascii="Arial" w:hAnsi="Arial"/>
+        </w:rPr>
+        <w:t>[2] Anysphere, "Cursor Agent (Claude Opus 5.5)," AI coding agent, 2026. [Online]. Available: https://cursor.com</w:t>
+      </w:r>
+    </w:p>
+    <w:p>
+      <w:r>
+        <w:rPr>
+          <w:rFonts w:ascii="Arial" w:hAnsi="Arial"/>
+        </w:rPr>
+        <w:t>[3] OpenAI, "Codex," AI coding agent, 2026. [Online]. Available: https://openai.com/codex</w:t>
+      </w:r>
+    </w:p>
+    <w:p>
+      <w:pPr>
+        <w:pStyle w:val="Heading2"/>
+      </w:pPr>
+      <w:r>
+        <w:rPr>
+          <w:rFonts w:ascii="Arial" w:hAnsi="Arial"/>
+        </w:rPr>
+        <w:t>3. Statement of Honesty</w:t>
+      </w:r>
+    </w:p>
+    <w:p>
+      <w:r>
+        <w:rPr>
+          <w:rFonts w:ascii="Arial" w:hAnsi="Arial"/>
+          <w:i/>
+        </w:rPr>
+        <w:t>By signing below, I confirm that the disclosure above is accurate and complete. I understand that undisclosed or false disclosure of AI use is treated as academic misconduct and may result in a 0 grade for the assignment and disciplinary referral.</w:t>
+      </w:r>
+    </w:p>
+    <w:p>
+      <w:pPr>
+        <w:pStyle w:val="Heading2"/>
+      </w:pPr>
+      <w:r>
+        <w:rPr>
+          <w:rFonts w:ascii="Arial" w:hAnsi="Arial"/>
+        </w:rPr>
+        <w:t>Signature</w:t>
+      </w:r>
+    </w:p>
+    <w:tbl>
+      <w:tblPr>
+        <w:tblStyle w:val="LightGrid-Accent1"/>
+        <w:tblW w:w="0" w:type="auto"/>
+        <w:tblLayout w:type="fixed"/>
+        <w:tblLook w:val="04A0" w:firstRow="1" w:lastRow="0" w:firstColumn="1" w:lastColumn="0" w:noHBand="0" w:noVBand="1"/>
+      </w:tblPr>
+      <w:tblGrid>
+        <w:gridCol w:w="3118"/>
+        <w:gridCol w:w="6520"/>
+      </w:tblGrid>
+      <w:tr>
+        <w:trPr>
+          <w:cnfStyle w:val="100000000000" w:firstRow="1" w:lastRow="0" w:firstColumn="0" w:lastColumn="0" w:oddVBand="0" w:evenVBand="0" w:oddHBand="0" w:evenHBand="0" w:firstRowFirstColumn="0" w:firstRowLastColumn="0" w:lastRowFirstColumn="0" w:lastRowLastColumn="0"/>
+        </w:trPr>
+        <w:tc>
+          <w:tcPr>
+            <w:cnfStyle w:val="001000000000" w:firstRow="0" w:lastRow="0" w:firstColumn="1" w:lastColumn="0" w:oddVBand="0" w:evenVBand="0" w:oddHBand="0" w:evenHBand="0" w:firstRowFirstColumn="0" w:firstRowLastColumn="0" w:lastRowFirstColumn="0" w:lastRowLastColumn="0"/>
+            <w:tcW w:w="3118" w:type="dxa"/>
+            <w:shd w:val="clear" w:color="auto" w:fill="D9E1F2"/>
+          </w:tcPr>
+          <w:p>
+            <w:r>
+              <w:rPr>
+                <w:rFonts w:ascii="Arial" w:hAnsi="Arial"/>
+                <w:sz w:val="21"/>
+              </w:rPr>
+              <w:t>Student name (printed):</w:t>
+            </w:r>
+          </w:p>
+        </w:tc>
+        <w:tc>
+          <w:tcPr>
+            <w:tcW w:w="6520" w:type="dxa"/>
+          </w:tcPr>
+          <w:p>
+            <w:pPr>
+              <w:cnfStyle w:val="100000000000" w:firstRow="1" w:lastRow="0" w:firstColumn="0" w:lastColumn="0" w:oddVBand="0" w:evenVBand="0" w:oddHBand="0" w:evenHBand="0" w:firstRowFirstColumn="0" w:firstRowLastColumn="0" w:lastRowFirstColumn="0" w:lastRowLastColumn="0"/>
+            </w:pPr>
+            <w:r>
+              <w:rPr>
+                <w:rFonts w:ascii="Arial" w:hAnsi="Arial"/>
+                <w:sz w:val="21"/>
+              </w:rPr>
+              <w:t>Huỳnh Thái Toàn</w:t>
+            </w:r>
+          </w:p>
+        </w:tc>
+      </w:tr>
+      <w:tr>
+        <w:trPr>
+          <w:cnfStyle w:val="000000100000" w:firstRow="0" w:lastRow="0" w:firstColumn="0" w:lastColumn="0" w:oddVBand="0" w:evenVBand="0" w:oddHBand="1" w:evenHBand="0" w:firstRowFirstColumn="0" w:firstRowLastColumn="0" w:lastRowFirstColumn="0" w:lastRowLastColumn="0"/>
+        </w:trPr>
+        <w:tc>
+          <w:tcPr>
+            <w:cnfStyle w:val="001000000000" w:firstRow="0" w:lastRow="0" w:firstColumn="1" w:lastColumn="0" w:oddVBand="0" w:evenVBand="0" w:oddHBand="0" w:evenHBand="0" w:firstRowFirstColumn="0" w:firstRowLastColumn="0" w:lastRowFirstColumn="0" w:lastRowLastColumn="0"/>
+            <w:tcW w:w="3118" w:type="dxa"/>
+            <w:shd w:val="clear" w:color="auto" w:fill="D9E1F2"/>
+          </w:tcPr>
+          <w:p>
+            <w:r>
+              <w:rPr>
+                <w:rFonts w:ascii="Arial" w:hAnsi="Arial"/>
+                <w:sz w:val="21"/>
+              </w:rPr>
+              <w:t>Student ID:</w:t>
+            </w:r>
+          </w:p>
+        </w:tc>
+        <w:tc>
+          <w:tcPr>
+            <w:tcW w:w="6520" w:type="dxa"/>
+          </w:tcPr>
+          <w:p>
+            <w:pPr>
+              <w:cnfStyle w:val="000000100000" w:firstRow="0" w:lastRow="0" w:firstColumn="0" w:lastColumn="0" w:oddVBand="0" w:evenVBand="0" w:oddHBand="1" w:evenHBand="0" w:firstRowFirstColumn="0" w:firstRowLastColumn="0" w:lastRowFirstColumn="0" w:lastRowLastColumn="0"/>
+            </w:pPr>
+            <w:r>
+              <w:rPr>
+                <w:rFonts w:ascii="Arial" w:hAnsi="Arial"/>
+                <w:sz w:val="21"/>
+              </w:rPr>
+              <w:t>23120175</w:t>
+            </w:r>
+          </w:p>
+        </w:tc>
+      </w:tr>
+      <w:tr>
+        <w:trPr>
+          <w:cnfStyle w:val="000000010000" w:firstRow="0" w:lastRow="0" w:firstColumn="0" w:lastColumn="0" w:oddVBand="0" w:evenVBand="0" w:oddHBand="0" w:evenHBand="1" w:firstRowFirstColumn="0" w:firstRowLastColumn="0" w:lastRowFirstColumn="0" w:lastRowLastColumn="0"/>
+        </w:trPr>
+        <w:tc>
+          <w:tcPr>
+            <w:cnfStyle w:val="001000000000" w:firstRow="0" w:lastRow="0" w:firstColumn="1" w:lastColumn="0" w:oddVBand="0" w:evenVBand="0" w:oddHBand="0" w:evenHBand="0" w:firstRowFirstColumn="0" w:firstRowLastColumn="0" w:lastRowFirstColumn="0" w:lastRowLastColumn="0"/>
+            <w:tcW w:w="3118" w:type="dxa"/>
+            <w:shd w:val="clear" w:color="auto" w:fill="D9E1F2"/>
+          </w:tcPr>
+          <w:p>
+            <w:r>
+              <w:rPr>
+                <w:rFonts w:ascii="Arial" w:hAnsi="Arial"/>
+                <w:sz w:val="21"/>
+              </w:rPr>
+              <w:t>Class / Cohort:</w:t>
+            </w:r>
+          </w:p>
+        </w:tc>
+        <w:tc>
+          <w:tcPr>
+            <w:tcW w:w="6520" w:type="dxa"/>
+          </w:tcPr>
+          <w:p>
+            <w:pPr>
+              <w:cnfStyle w:val="000000010000" w:firstRow="0" w:lastRow="0" w:firstColumn="0" w:lastColumn="0" w:oddVBand="0" w:evenVBand="0" w:oddHBand="0" w:evenHBand="1" w:firstRowFirstColumn="0" w:firstRowLastColumn="0" w:lastRowFirstColumn="0" w:lastRowLastColumn="0"/>
+            </w:pPr>
+            <w:r>
+              <w:rPr>
+                <w:rFonts w:ascii="Arial" w:hAnsi="Arial"/>
+                <w:sz w:val="21"/>
+              </w:rPr>
+              <w:t>CQ2023/31</w:t>
+            </w:r>
+          </w:p>
+        </w:tc>
+      </w:tr>
+      <w:tr>
+        <w:trPr>
+          <w:cnfStyle w:val="000000100000" w:firstRow="0" w:lastRow="0" w:firstColumn="0" w:lastColumn="0" w:oddVBand="0" w:evenVBand="0" w:oddHBand="1" w:evenHBand="0" w:firstRowFirstColumn="0" w:firstRowLastColumn="0" w:lastRowFirstColumn="0" w:lastRowLastColumn="0"/>
+        </w:trPr>
+        <w:tc>
+          <w:tcPr>
+            <w:cnfStyle w:val="001000000000" w:firstRow="0" w:lastRow="0" w:firstColumn="1" w:lastColumn="0" w:oddVBand="0" w:evenVBand="0" w:oddHBand="0" w:evenHBand="0" w:firstRowFirstColumn="0" w:firstRowLastColumn="0" w:lastRowFirstColumn="0" w:lastRowLastColumn="0"/>
+            <w:tcW w:w="3118" w:type="dxa"/>
+            <w:shd w:val="clear" w:color="auto" w:fill="D9E1F2"/>
+          </w:tcPr>
+          <w:p>
+            <w:r>
+              <w:rPr>
+                <w:rFonts w:ascii="Arial" w:hAnsi="Arial"/>
+                <w:sz w:val="21"/>
+              </w:rPr>
+              <w:t>Course:</w:t>
+            </w:r>
+          </w:p>
+        </w:tc>
+        <w:tc>
+          <w:tcPr>
+            <w:tcW w:w="6520" w:type="dxa"/>
+          </w:tcPr>
+          <w:p>
+            <w:pPr>
+              <w:cnfStyle w:val="000000100000" w:firstRow="0" w:lastRow="0" w:firstColumn="0" w:lastColumn="0" w:oddVBand="0" w:evenVBand="0" w:oddHBand="1" w:evenHBand="0" w:firstRowFirstColumn="0" w:firstRowLastColumn="0" w:lastRowFirstColumn="0" w:lastRowLastColumn="0"/>
+            </w:pPr>
+            <w:r>
+              <w:rPr>
+                <w:rFonts w:ascii="Arial" w:hAnsi="Arial"/>
+                <w:sz w:val="21"/>
+              </w:rPr>
+              <w:t>Software Testing</w:t>
+            </w:r>
+          </w:p>
+        </w:tc>
+      </w:tr>
+      <w:tr>
+        <w:trPr>
+          <w:cnfStyle w:val="000000010000" w:firstRow="0" w:lastRow="0" w:firstColumn="0" w:lastColumn="0" w:oddVBand="0" w:evenVBand="0" w:oddHBand="0" w:evenHBand="1" w:firstRowFirstColumn="0" w:firstRowLastColumn="0" w:lastRowFirstColumn="0" w:lastRowLastColumn="0"/>
+        </w:trPr>
+        <w:tc>
+          <w:tcPr>
+            <w:cnfStyle w:val="001000000000" w:firstRow="0" w:lastRow="0" w:firstColumn="1" w:lastColumn="0" w:oddVBand="0" w:evenVBand="0" w:oddHBand="0" w:evenHBand="0" w:firstRowFirstColumn="0" w:firstRowLastColumn="0" w:lastRowFirstColumn="0" w:lastRowLastColumn="0"/>
+            <w:tcW w:w="3118" w:type="dxa"/>
+            <w:shd w:val="clear" w:color="auto" w:fill="D9E1F2"/>
+          </w:tcPr>
+          <w:p>
+            <w:r>
+              <w:rPr>
+                <w:rFonts w:ascii="Arial" w:hAnsi="Arial"/>
+                <w:sz w:val="21"/>
+              </w:rPr>
+              <w:t>Instructor:</w:t>
+            </w:r>
+          </w:p>
+        </w:tc>
+        <w:tc>
+          <w:tcPr>
+            <w:tcW w:w="6520" w:type="dxa"/>
+          </w:tcPr>
+          <w:p>
+            <w:pPr>
+              <w:cnfStyle w:val="000000010000" w:firstRow="0" w:lastRow="0" w:firstColumn="0" w:lastColumn="0" w:oddVBand="0" w:evenVBand="0" w:oddHBand="0" w:evenHBand="1" w:firstRowFirstColumn="0" w:firstRowLastColumn="0" w:lastRowFirstColumn="0" w:lastRowLastColumn="0"/>
+            </w:pPr>
+            <w:r>
+              <w:rPr>
+                <w:rFonts w:ascii="Arial" w:hAnsi="Arial"/>
+                <w:sz w:val="21"/>
+              </w:rPr>
+              <w:t>MSc. Trần Thị Bích Hạnh</w:t>
+            </w:r>
+          </w:p>
+        </w:tc>
+      </w:tr>
+      <w:tr>
+        <w:trPr>
+          <w:cnfStyle w:val="000000100000" w:firstRow="0" w:lastRow="0" w:firstColumn="0" w:lastColumn="0" w:oddVBand="0" w:evenVBand="0" w:oddHBand="1" w:evenHBand="0" w:firstRowFirstColumn="0" w:firstRowLastColumn="0" w:lastRowFirstColumn="0" w:lastRowLastColumn="0"/>
+        </w:trPr>
+        <w:tc>
+          <w:tcPr>
+            <w:cnfStyle w:val="001000000000" w:firstRow="0" w:lastRow="0" w:firstColumn="1" w:lastColumn="0" w:oddVBand="0" w:evenVBand="0" w:oddHBand="0" w:evenHBand="0" w:firstRowFirstColumn="0" w:firstRowLastColumn="0" w:lastRowFirstColumn="0" w:lastRowLastColumn="0"/>
+            <w:tcW w:w="3118" w:type="dxa"/>
+            <w:shd w:val="clear" w:color="auto" w:fill="D9E1F2"/>
+          </w:tcPr>
+          <w:p>
+            <w:r>
+              <w:rPr>
+                <w:rFonts w:ascii="Arial" w:hAnsi="Arial"/>
+                <w:sz w:val="21"/>
+              </w:rPr>
+              <w:t>Date:</w:t>
+            </w:r>
+          </w:p>
+        </w:tc>
+        <w:tc>
+          <w:tcPr>
+            <w:tcW w:w="6520" w:type="dxa"/>
+          </w:tcPr>
+          <w:p>
+            <w:pPr>
+              <w:cnfStyle w:val="000000100000" w:firstRow="0" w:lastRow="0" w:firstColumn="0" w:lastColumn="0" w:oddVBand="0" w:evenVBand="0" w:oddHBand="1" w:evenHBand="0" w:firstRowFirstColumn="0" w:firstRowLastColumn="0" w:lastRowFirstColumn="0" w:lastRowLastColumn="0"/>
+            </w:pPr>
+            <w:r>
+              <w:rPr>
+                <w:rFonts w:ascii="Arial" w:hAnsi="Arial"/>
+                <w:sz w:val="21"/>
+              </w:rPr>
+              <w:t>27/09/2026</w:t>
+            </w:r>
+          </w:p>
+        </w:tc>
+      </w:tr>
+      <w:tr>
+        <w:trPr>
+          <w:cnfStyle w:val="000000010000" w:firstRow="0" w:lastRow="0" w:firstColumn="0" w:lastColumn="0" w:oddVBand="0" w:evenVBand="0" w:oddHBand="0" w:evenHBand="1" w:firstRowFirstColumn="0" w:firstRowLastColumn="0" w:lastRowFirstColumn="0" w:lastRowLastColumn="0"/>
+        </w:trPr>
+        <w:tc>
+          <w:tcPr>
+            <w:cnfStyle w:val="001000000000" w:firstRow="0" w:lastRow="0" w:firstColumn="1" w:lastColumn="0" w:oddVBand="0" w:evenVBand="0" w:oddHBand="0" w:evenHBand="0" w:firstRowFirstColumn="0" w:firstRowLastColumn="0" w:lastRowFirstColumn="0" w:lastRowLastColumn="0"/>
+            <w:tcW w:w="3118" w:type="dxa"/>
+            <w:shd w:val="clear" w:color="auto" w:fill="D9E1F2"/>
+          </w:tcPr>
+          <w:p>
+            <w:r>
+              <w:rPr>
+                <w:rFonts w:ascii="Arial" w:hAnsi="Arial"/>
+                <w:sz w:val="21"/>
+              </w:rPr>
+              <w:t>Signature:</w:t>
+            </w:r>
+          </w:p>
+        </w:tc>
+        <w:tc>
+          <w:tcPr>
+            <w:tcW w:w="6520" w:type="dxa"/>
+          </w:tcPr>
+          <w:p>
+            <w:pPr>
+              <w:cnfStyle w:val="000000010000" w:firstRow="0" w:lastRow="0" w:firstColumn="0" w:lastColumn="0" w:oddVBand="0" w:evenVBand="0" w:oddHBand="0" w:evenHBand="1" w:firstRowFirstColumn="0" w:firstRowLastColumn="0" w:lastRowFirstColumn="0" w:lastRowLastColumn="0"/>
+            </w:pPr>
+            <w:r>
+              <w:rPr>
+                <w:rFonts w:ascii="Arial" w:hAnsi="Arial"/>
+                <w:sz w:val="21"/>
+              </w:rPr>
+              <w:t>Huỳnh Thái Toàn</w:t>
+            </w:r>
+            <w:r>
+              <w:rPr>
+                <w:rFonts w:ascii="Myriad Pro" w:hAnsi="Myriad Pro" w:cs="Tahoma"/>
+                <w:noProof/>
+                <w:lang w:eastAsia="vi-VN"/>
+              </w:rPr>
+              <w:drawing>
+                <wp:inline distT="0" distB="0" distL="0" distR="0" wp14:anchorId="63E61BDF" wp14:editId="0DC83652">
+                  <wp:extent cx="781235" cy="415290"/>
+                  <wp:effectExtent l="0" t="0" r="0" b="3810"/>
+                  <wp:docPr id="1018047995" name="Picture 2"/>
+                  <wp:cNvGraphicFramePr>
+                    <a:graphicFrameLocks xmlns:a="http://schemas.openxmlformats.org/drawingml/2006/main" noChangeAspect="1"/>
+                  </wp:cNvGraphicFramePr>
+                  <a:graphic xmlns:a="http://schemas.openxmlformats.org/drawingml/2006/main">
+                    <a:graphicData uri="http://schemas.openxmlformats.org/drawingml/2006/picture">
+                      <pic:pic xmlns:pic="http://schemas.openxmlformats.org/drawingml/2006/picture">
+                        <pic:nvPicPr>
+                          <pic:cNvPr id="1018047995" name="Picture 2"/>
+                          <pic:cNvPicPr/>
+                        </pic:nvPicPr>
+                        <pic:blipFill rotWithShape="1">
+                          <a:blip r:embed="rId6" cstate="print">
+                            <a:duotone>
+                              <a:schemeClr val="accent1">
+                                <a:shade val="45000"/>
+                                <a:satMod val="135000"/>
+                              </a:schemeClr>
+                              <a:prstClr val="white"/>
+                            </a:duotone>
+                            <a:extLst>
+                              <a:ext uri="{28A0092B-C50C-407E-A947-70E740481C1C}">
+                                <a14:useLocalDpi xmlns:a14="http://schemas.microsoft.com/office/drawing/2010/main" val="0"/>
+                              </a:ext>
+                            </a:extLst>
+                          </a:blip>
+                          <a:srcRect l="7270" t="22563" r="16482" b="25379"/>
+                          <a:stretch>
+                            <a:fillRect/>
+                          </a:stretch>
+                        </pic:blipFill>
+                        <pic:spPr bwMode="auto">
+                          <a:xfrm>
+                            <a:off x="0" y="0"/>
+                            <a:ext cx="856562" cy="455332"/>
+                          </a:xfrm>
+                          <a:prstGeom prst="rect">
+                            <a:avLst/>
+                          </a:prstGeom>
+                          <a:ln>
+                            <a:noFill/>
+                          </a:ln>
+                          <a:extLst>
+                            <a:ext uri="{53640926-AAD7-44D8-BBD7-CCE9431645EC}">
+                              <a14:shadowObscured xmlns:a14="http://schemas.microsoft.com/office/drawing/2010/main"/>
+                            </a:ext>
+                          </a:extLst>
+                        </pic:spPr>
+                      </pic:pic>
+                    </a:graphicData>
+                  </a:graphic>
+                </wp:inline>
+              </w:drawing>
+            </w:r>
+          </w:p>
+        </w:tc>
+      </w:tr>
+    </w:tbl>
+    <w:p>
+      <w:pPr>
+        <w:pStyle w:val="Heading2"/>
+      </w:pPr>
+      <w:r>
+        <w:rPr>
+          <w:rFonts w:ascii="Arial" w:hAnsi="Arial"/>
+        </w:rPr>
+        <w:lastRenderedPageBreak/>
+        <w:t>References</w:t>
+      </w:r>
+    </w:p>
+    <w:p>
+      <w:pPr>
+        <w:pStyle w:val="ListBullet"/>
+      </w:pPr>
+      <w:r>
+        <w:rPr>
+          <w:rFonts w:ascii="Arial" w:hAnsi="Arial"/>
+        </w:rPr>
+        <w:t>Kharbach, M. (2026). AI Use Policy Templates for Higher Education. CC BY-NC-SA 4.0.</w:t>
+      </w:r>
+    </w:p>
+    <w:p>
+      <w:pPr>
+        <w:pStyle w:val="ListBullet"/>
+      </w:pPr>
+      <w:r>
+        <w:rPr>
+          <w:rFonts w:ascii="Arial" w:hAnsi="Arial"/>
+        </w:rPr>
+        <w:t>ISTQB Foundation Level Syllabus (latest version).</w:t>
+      </w:r>
+    </w:p>
+    <w:p>
+      <w:pPr>
+        <w:pStyle w:val="ListBullet"/>
+      </w:pPr>
+      <w:r>
+        <w:rPr>
+          <w:rFonts w:ascii="Arial" w:hAnsi="Arial"/>
+        </w:rPr>
+        <w:t>Hardman, P. (2025). A Post-AI Learning Taxonomy.</w:t>
+      </w:r>
+    </w:p>
+    <w:p>
+      <w:pPr>
+        <w:pStyle w:val="ListBullet"/>
+      </w:pPr>
+      <w:r>
+        <w:rPr>
+          <w:rFonts w:ascii="Arial" w:hAnsi="Arial"/>
+        </w:rPr>
+        <w:t>Fuster Rabella, M. (2025). OECD Education Working Paper No. 338.</w:t>
+      </w:r>
+    </w:p>
+    <w:p>
+      <w:pPr>
+        <w:pStyle w:val="ListBullet"/>
+      </w:pPr>
+      <w:r>
+        <w:rPr>
+          <w:rFonts w:ascii="Arial" w:hAnsi="Arial"/>
+        </w:rPr>
+        <w:t>Perkins, M., Roe, J., &amp; Furze, L. (2025). AI Assessment Scale.</w:t>
+      </w:r>
+    </w:p>
+    <w:p>
+      <w:pPr>
+        <w:pStyle w:val="ListBullet"/>
+      </w:pPr>
+      <w:r>
+        <w:rPr>
+          <w:rFonts w:ascii="Arial" w:hAnsi="Arial"/>
+        </w:rPr>
+        <w:t>Anthropic (2025). Building reliable AI test agents — engineering blog.</w:t>
+      </w:r>
+    </w:p>
+    <w:p>
+      <w:pPr>
+        <w:pStyle w:val="ListBullet"/>
+      </w:pPr>
+      <w:r>
+        <w:rPr>
+          <w:rFonts w:ascii="Arial" w:hAnsi="Arial"/>
+        </w:rPr>
+        <w:t>DeepEval &amp; Promptfoo documentation — testing frameworks for LLM systems.</w:t>
+      </w:r>
+    </w:p>
+    <w:sectPr>
+      <w:pgSz w:w="12240" w:h="15840"/>
+      <w:pgMar w:top="1440" w:right="1800" w:bottom="1440" w:left="1800" w:header="720" w:footer="720" w:gutter="0"/>
+      <w:cols w:space="720"/>
+      <w:docGrid w:linePitch="360"/>
+    </w:sectPr>
+  </w:body>
+</w:document>
 </file>
 
 <file path=word/numbering.xml><?xml version="1.0" encoding="utf-8"?>

</xml_diff>